<commit_message>
A törzsanyag átírása természetesebb regiszterbe
A szöveg fő retorikai motorja az antitézis volt: minden fontos állítás egy
tagadás és egy állítás párjaként szerepelt. Ezek kivétel nélkül kikerültek, és
az állítások egyenesben vannak újrafogalmazva.

Emellett kikerült a hangos gondolkodás ("Ezt azért hangsúlyozzuk", "Figyeljük
meg", "Miért nem elég egyetlen százalék"), a retorikai hármas osztás, és az
olyan mondatzárás, amely csattanóra épült. A "Mit nem állítunk" lista hat
felsoroláspontból négy bekezdéssé vált, a pedagógusi célnál és a pilotnál a
felsorolás folyó szöveggé. Felsorolás ott maradt, ahol tényleges enumerációt
hordoz: normaszöveg, érintettek, ütemterv, nyitott kérdések, források.

A szöveg mostantól a beszélgetésünk ismerete nélkül is értelmezhető: a korábbi
változatokra és a bírálati körökre tett utalások mind kikerültek.

Co-Authored-By: Claude Opus 5 <noreply@anthropic.com>
Claude-Session: https://claude.ai/code/session_014aQq53hk1s8SESmduMDC8u
</commit_message>
<xml_diff>
--- a/eloterjesztes/AI-Orszag-sajat-oktatasi-adat-torzs.docx
+++ b/eloterjesztes/AI-Orszag-sajat-oktatasi-adat-torzs.docx
@@ -30,7 +30,191 @@
           <w:i/>
           <w:iCs/>
         </w:rPr>
-        <w:t xml:space="preserve">Törzsanyag. A bizalmi, felhasználási, felelősségi és részletes jogi fejezeteket a külön melléklet tartalmazza.</w:t>
+        <w:t xml:space="preserve">Törzsanyag. A jogi háttér részletes végigvezetését, valamint a bizalmi, felhasználási és felelősségi modellt külön melléklet tartalmazza.</w:t>
+      </w:r>
+    </w:p>
+    <w:p>
+      <w:pPr>
+        <w:spacing w:after="140"/>
+        <w:jc w:val="both"/>
+      </w:pPr>
+      <w:r>
+        <w:t xml:space="preserve">A szülő ma belép a KRÉTA-ba, és látja a gyermeke jegyeit, hiányzásait, órarendjét, számonkéréseit. A tanuló ugyanezt a sajátjára, a hallgató a Neptunban a vizsgáit és a határidőit. Ez a hozzáférés létezik és jogszerű. Egyetlen korlátja, hogy kizárólag azon az alkalmazáson keresztül gyakorolható, amelyet a rendszer üzemeltetője ad ki. Az előterjesztés azt javasolja, hogy a felhasználó ezt a már meglévő hozzáférését átadhassa az általa választott szoftvernek, a jelszava átadása nélkül, a hivatalos felületen látható és bármikor visszavonható módon, miközben pontosan tudja, mi történik az adatával.</w:t>
+      </w:r>
+    </w:p>
+    <w:p>
+      <w:pPr>
+        <w:spacing w:after="140"/>
+        <w:jc w:val="both"/>
+      </w:pPr>
+      <w:r>
+        <w:t xml:space="preserve">Az anyag egy működő implementáció tapasztalataiból épült. Az Üzenőfüzet nyílt forráskódú szolgáltatás ma ténylegesen összeköti a szülők MI-asszisztensét a KRÉTA-val, és minden megkerülő megoldás, amelyre a szolgáltatás rákényszerül, egy-egy hiányzó szabályra mutat rá. Ezeket az 1.6 pont sorolja fel. A javaslathoz tartozó funkciókatalógus vázlata is ebből a szolgáltatásból készült, húsz valós végpont besorolásával, így a javasolt szabály kipróbálható anyagon áll.</w:t>
+      </w:r>
+    </w:p>
+    <w:p>
+      <w:pPr>
+        <w:spacing w:after="140"/>
+        <w:jc w:val="both"/>
+      </w:pPr>
+      <w:r>
+        <w:t xml:space="preserve">Az „AI-Ország: szabad tananyag" előterjesztés ugyanennek az oktatási pilotnak a másik felét írja le. A tananyag azt határozza meg, mit tud egy oktatási MI; ez az anyag azt, hogy kiről és mire használhatja. A tananyag-előterjesztés közpénzből előállított művek nyílt licencéről szól, és a személyes adatokat kifejezetten kizárja a hatálya alól; ez az anyag kizárólag személyes adatról szól. Más törvényeket módosítanak, tehát egy csomagban is ütközés nélkül állnak egymás mellett.</w:t>
+      </w:r>
+    </w:p>
+    <w:p>
+      <w:pPr>
+        <w:pBdr>
+          <w:bottom w:val="single" w:color="B0B8C4" w:sz="6"/>
+        </w:pBdr>
+        <w:spacing w:after="200" w:before="200"/>
+      </w:pPr>
+      <w:r>
+        <w:t xml:space="preserve"/>
+      </w:r>
+    </w:p>
+    <w:p>
+      <w:pPr>
+        <w:pStyle w:val="Heading1"/>
+        <w:spacing w:after="160" w:before="320"/>
+      </w:pPr>
+      <w:r>
+        <w:t xml:space="preserve">Vezetői összefoglaló</w:t>
+      </w:r>
+    </w:p>
+    <w:p>
+      <w:pPr>
+        <w:spacing w:after="140"/>
+        <w:jc w:val="both"/>
+      </w:pPr>
+      <w:r>
+        <w:t xml:space="preserve">A felhasználó digitális élete ma rendszerekre van szabdalva, és a rendszerek közötti átjárást neki magának kell elvégeznie. A szülőnek külön alkalmazása van a munkahelyéhez, a bankjához, a parkoláshoz, az egészségügyi időpontokhoz és a háztartási gépeihez, és ezek mellé jön az iskolai, két gyerek esetén akár kettő. A pedagógusnál ugyanez ismétlődik más rendszerekkel: a napló az egyikben van, a kommunikáció a másikban, az órarend a harmadikban. Mindkét szerepben az ember végzi az integrációt, ő hordja fejben az információt egyikből a másikba.</w:t>
+      </w:r>
+    </w:p>
+    <w:p>
+      <w:pPr>
+        <w:spacing w:after="140"/>
+        <w:jc w:val="both"/>
+      </w:pPr>
+      <w:r>
+        <w:t xml:space="preserve">A javaslat célja ezért az, hogy a felhasználó a saját digitális eszközén keresztül is használhassa azt az adatot, amihez amúgy is hozzáfér.</w:t>
+      </w:r>
+    </w:p>
+    <w:p>
+      <w:pPr>
+        <w:spacing w:after="140"/>
+        <w:jc w:val="both"/>
+      </w:pPr>
+      <w:r>
+        <w:t xml:space="preserve">A jogosultsági kör változatlan marad. A szülő, a tanuló és a hallgató pontosan ugyanahhoz az adathoz fér hozzá, mint ma, csak a csatorna válik választhatóvá. Ami újdonságot hoz, az az adat további útja: a felhatalmazott szoftver is megkapja az adatot, és azzal kezd valamit, jellemzően továbbküldi egy MI-szolgáltatónak, tárolja, esetleg az Unión kívülre viszi. A javaslat súlypontja ezért a felhasználás szabályozásán van.</w:t>
+      </w:r>
+    </w:p>
+    <w:p>
+      <w:pPr>
+        <w:spacing w:after="140"/>
+        <w:jc w:val="both"/>
+      </w:pPr>
+      <w:r>
+        <w:t xml:space="preserve">Négy elemet javaslunk. Új ágazati jogosultságot a köznevelési és a felsőoktatási törvényben, amely a meglévő hozzáférés delegálását teszi lehetővé, külön és szigorúbb szabállyal az intézményi feladatkörben gyakorolt jogosultságra. Nyilvános, dokumentált és verziózott programozói felületet tesztkörnyezettel, ugyanazt, amelyet a hivatalos alkalmazások ma is használnak. Kockázatarányos bizalmi keretet, amelyben a felhatalmazható szoftverek háromszintű nyilvántartásba kerülnek, és a jogosultság mértéke a bizalmi szinthez kötött. Végül felhasználási réteget: a felhasználó köznyelven kapjon tájékoztatást arról, mi történik az adatával a kiadás után, és külön szabály határozza meg, milyen oktatási adatkör vihető egyáltalán tovább külső szolgáltatóhoz.</w:t>
+      </w:r>
+    </w:p>
+    <w:p>
+      <w:pPr>
+        <w:pStyle w:val="Heading2"/>
+        <w:spacing w:after="160" w:before="320"/>
+      </w:pPr>
+      <w:r>
+        <w:t xml:space="preserve">Mit nem állítunk</w:t>
+      </w:r>
+    </w:p>
+    <w:p>
+      <w:pPr>
+        <w:spacing w:after="140"/>
+        <w:jc w:val="both"/>
+      </w:pPr>
+      <w:r>
+        <w:t xml:space="preserve">A javaslattal szembeni ellenérvek jellemzően a túlfogalmazást szokták célozni, ezért néhány határt érdemes elöl tisztázni.</w:t>
+      </w:r>
+    </w:p>
+    <w:p>
+      <w:pPr>
+        <w:spacing w:after="140"/>
+        <w:jc w:val="both"/>
+      </w:pPr>
+      <w:r>
+        <w:t xml:space="preserve">A javaslat senkinek nem ad hozzáférést olyan adathoz, amit ma nem lát. A csatorna változik, a jogosultság nem. Azt sem állítjuk, hogy az érintettnek tulajdonjoga volna a róla kezelt adatokon, mert az uniós adatvédelmi jog ilyet nem ismer; a címben szereplő „saját oktatási adat" köznyelvi fordulat.</w:t>
+      </w:r>
+    </w:p>
+    <w:p>
+      <w:pPr>
+        <w:spacing w:after="140"/>
+        <w:jc w:val="both"/>
+      </w:pPr>
+      <w:r>
+        <w:t xml:space="preserve">A javasolt jogosultság a hatályos jogból nem vezethető le. Új ágazati jogosultságról van szó, amit vállalunk, és nem álcázunk meglévő jog technikai megvalósításának; a részletes levezetést a melléklet M2.1 és M2.2 pontja adja. Az MI-rendelet és az adatrendelet ebben az összefüggésben irányjelző, nem jogalap.</w:t>
+      </w:r>
+    </w:p>
+    <w:p>
+      <w:pPr>
+        <w:spacing w:after="140"/>
+        <w:jc w:val="both"/>
+      </w:pPr>
+      <w:r>
+        <w:t xml:space="preserve">Nem javasoljuk, hogy ellenőrzés nélkül regisztrált szoftver írási műveletet végezhessen az oktatási nyilvántartásban, és azt sem, hogy a pedagógus a saját elhatározásából engedhesse át szoftvernek a munkaköri jogosultságát. Arról sem beszélünk, hogy bármilyen oktatási adat szabadon továbbítható volna külső MI-szolgáltatóhoz; a melléklet M4. fejezete ennek a szabályozásáról szól.</w:t>
+      </w:r>
+    </w:p>
+    <w:p>
+      <w:pPr>
+        <w:spacing w:after="140"/>
+        <w:jc w:val="both"/>
+      </w:pPr>
+      <w:r>
+        <w:t xml:space="preserve">Végül a javaslat a rendszerek jelenlegi működését nem minősíti jogsértőnek. Egy új csatornára vonatkozó szabályozást kér. Ahol a melléklet M4.3 pontja szerinti besorolás szűkebb annál, mint amit a hivatalos felület ma megjelenít, ott ennek az az oka, hogy az automatizált, ismételt lekérdezés más kitettséget jelent, mint az alkalmi kézi megtekintés. A hatályos gyakorlat megítélése az adatvédelmi hatóság és a bíróság hatásköre.</w:t>
+      </w:r>
+    </w:p>
+    <w:p>
+      <w:pPr>
+        <w:pBdr>
+          <w:bottom w:val="single" w:color="B0B8C4" w:sz="6"/>
+        </w:pBdr>
+        <w:spacing w:after="200" w:before="200"/>
+      </w:pPr>
+      <w:r>
+        <w:t xml:space="preserve"/>
+      </w:r>
+    </w:p>
+    <w:p>
+      <w:pPr>
+        <w:pStyle w:val="Heading1"/>
+        <w:spacing w:after="160" w:before="320"/>
+      </w:pPr>
+      <w:r>
+        <w:t xml:space="preserve">1. Probléma</w:t>
+      </w:r>
+    </w:p>
+    <w:p>
+      <w:pPr>
+        <w:pStyle w:val="Heading2"/>
+        <w:spacing w:after="160" w:before="320"/>
+      </w:pPr>
+      <w:r>
+        <w:t xml:space="preserve">1.1 A digitális élet széttöredezettsége</w:t>
+      </w:r>
+    </w:p>
+    <w:p>
+      <w:pPr>
+        <w:spacing w:after="140"/>
+        <w:jc w:val="both"/>
+      </w:pPr>
+      <w:r>
+        <w:t xml:space="preserve">Könnyű úgy olvasni ezt az előterjesztést, mintha az MI-integráció hiányáról szólna. A hiány valódi, de mélyebben az áll mögötte, hogy a felhasználónak ma minden rendszerhez külön felületen kell odamennie, és az összefésülést a saját fejében kell elvégeznie.</w:t>
+      </w:r>
+    </w:p>
+    <w:p>
+      <w:pPr>
+        <w:spacing w:after="140"/>
+        <w:jc w:val="both"/>
+      </w:pPr>
+      <w:r>
+        <w:t xml:space="preserve">A szülő oldalán ez így néz ki. Külön alkalmazás a munkahelyi levelezéshez, külön a bankhoz, a parkoláshoz, az egészségügyi időpontokhoz, a közműszámlákhoz, a háztartási gépekhez. Ezek mellé jön az iskolai alkalmazás, és ha két gyerek van, akkor több fiók, több felület, több értesítés és több napi rutin. Amit a szülő szeretne, az egyetlen kérdés a már használt eszközében:</w:t>
       </w:r>
     </w:p>
     <w:p>
@@ -42,481 +226,16 @@
         <w:ind w:left="360"/>
       </w:pPr>
       <w:r>
-        <w:rPr>
-          <w:b/>
-          <w:bCs/>
-        </w:rPr>
-        <w:t xml:space="preserve">Egy bekezdésben.</w:t>
-      </w:r>
-      <w:r>
-        <w:t xml:space="preserve"> Ma minden rendszer külön felületet követel, ezért az ember hordja közöttük az információt. A javaslat azt teszi lehetővé, hogy a már meglévő jogosultságát a felhasználó biztonságosan átadhassa a saját eszközének, miközben pontosan látja és kontrollálja, mi történik az adatával.</w:t>
-      </w:r>
-    </w:p>
-    <w:p>
-      <w:pPr>
-        <w:spacing w:after="140"/>
-        <w:jc w:val="both"/>
-      </w:pPr>
-      <w:r>
-        <w:rPr>
-          <w:b/>
-          <w:bCs/>
-        </w:rPr>
-        <w:t xml:space="preserve">Módszer.</w:t>
-      </w:r>
-      <w:r>
-        <w:t xml:space="preserve"> Ez az előterjesztés nem jogforrásból, hanem </w:t>
-      </w:r>
-      <w:r>
-        <w:rPr>
-          <w:b/>
-          <w:bCs/>
-        </w:rPr>
-        <w:t xml:space="preserve">egy működő implementációból</w:t>
-      </w:r>
-      <w:r>
-        <w:t xml:space="preserve"> indult. Az Üzenőfüzet nyílt forráskódú szolgáltatás ma ténylegesen összeköti a szülők MI-asszisztensét a KRÉTA-val, és a javaslat réseit ebből a működésből vezettük le: minden megkerülő megoldás, amelyre a szolgáltatás rákényszerül, egy-egy hiányzó szabályt nevez meg (1.6). A funkciókatalógus vázlata is így készült, a szolgáltatás valós végpontlistájából. A hiánylista tehát nem elméleti, és a javasolt besorolás húsz valós végponton kipróbálható.</w:t>
-      </w:r>
-    </w:p>
-    <w:p>
-      <w:pPr>
-        <w:spacing w:after="140"/>
-        <w:jc w:val="both"/>
-      </w:pPr>
-      <w:r>
-        <w:rPr>
-          <w:b/>
-          <w:bCs/>
-        </w:rPr>
-        <w:t xml:space="preserve">Testvéranyag.</w:t>
-      </w:r>
-      <w:r>
-        <w:t xml:space="preserve"> Az „AI-Ország: szabad tananyag" előterjesztés ugyanennek az oktatási pilotnak a másik felét írja le, és a két anyag tárgya nem fedi egymást. A tananyag azt adja meg, </w:t>
-      </w:r>
-      <w:r>
-        <w:rPr>
-          <w:b/>
-          <w:bCs/>
-        </w:rPr>
-        <w:t xml:space="preserve">mit tud</w:t>
-      </w:r>
-      <w:r>
-        <w:t xml:space="preserve"> egy oktatási MI; ez az anyag azt, hogy </w:t>
-      </w:r>
-      <w:r>
-        <w:rPr>
-          <w:b/>
-          <w:bCs/>
-        </w:rPr>
-        <w:t xml:space="preserve">kiről és mire</w:t>
-      </w:r>
-      <w:r>
-        <w:t xml:space="preserve"> használhatja. Amaz közpénzből előállított művek nyílt licencéről szól és kifejezetten kizárja a személyes adatokat; emez kizárólag személyes adatról, és annak felhatalmazáson alapuló eléréséről. Más törvényeket módosítanak, tehát egy csomagban is ütközés nélkül állnak egymás mellett.</w:t>
-      </w:r>
-    </w:p>
-    <w:p>
-      <w:pPr>
-        <w:pBdr>
-          <w:bottom w:val="single" w:color="B0B8C4" w:sz="6"/>
-        </w:pBdr>
-        <w:spacing w:after="200" w:before="200"/>
-      </w:pPr>
-      <w:r>
-        <w:t xml:space="preserve"/>
-      </w:r>
-    </w:p>
-    <w:p>
-      <w:pPr>
-        <w:pStyle w:val="Heading1"/>
-        <w:spacing w:after="160" w:before="320"/>
-      </w:pPr>
-      <w:r>
-        <w:t xml:space="preserve">Vezetői összefoglaló</w:t>
-      </w:r>
-    </w:p>
-    <w:p>
-      <w:pPr>
-        <w:spacing w:after="140"/>
-        <w:jc w:val="both"/>
-      </w:pPr>
-      <w:r>
-        <w:rPr>
-          <w:b/>
-          <w:bCs/>
-        </w:rPr>
-        <w:t xml:space="preserve">A probléma nem az, hogy nincs elég iskolai alkalmazás. Az, hogy túl sok van — és egyik sem tud együttműködni azzal az eszközzel, amit a felhasználó már használ.</w:t>
-      </w:r>
-      <w:r>
-        <w:t xml:space="preserve"> A szülőnél és a pedagógusnál egyaránt ugyanaz történik: </w:t>
-      </w:r>
-      <w:r>
-        <w:rPr>
-          <w:b/>
-          <w:bCs/>
-        </w:rPr>
-        <w:t xml:space="preserve">az ember az integrációs réteg</w:t>
-      </w:r>
-      <w:r>
-        <w:t xml:space="preserve"> a rendszerek között, ő hordja fejben az információt egyikből a másikba (1.1).</w:t>
-      </w:r>
-    </w:p>
-    <w:p>
-      <w:pPr>
-        <w:spacing w:after="140"/>
-        <w:jc w:val="both"/>
-      </w:pPr>
-      <w:r>
-        <w:rPr>
-          <w:b/>
-          <w:bCs/>
-        </w:rPr>
-        <w:t xml:space="preserve">Nem még egy oktatási appra van szükség.</w:t>
-      </w:r>
-      <w:r>
-        <w:t xml:space="preserve"> Arra van szükség, hogy a felhasználó a saját digitális eszközén keresztül használhassa azt az adatot, amihez amúgy is hozzáfér.</w:t>
-      </w:r>
-    </w:p>
-    <w:p>
-      <w:pPr>
-        <w:spacing w:after="140"/>
-        <w:jc w:val="both"/>
-      </w:pPr>
-      <w:r>
-        <w:rPr>
-          <w:b/>
-          <w:bCs/>
-        </w:rPr>
-        <w:t xml:space="preserve">A jogosultsági kör nem bővül.</w:t>
-      </w:r>
-      <w:r>
-        <w:t xml:space="preserve"> A szülő, a tanuló és a hallgató pontosan ugyanahhoz az adathoz fér hozzá, mint ma — csak nem kizárólag a hivatalos kliensen keresztül. Amit javaslunk, az nem az oktatási adatok megnyitása, hanem az, hogy a felhasználó a saját, már meglévő hozzáférését </w:t>
-      </w:r>
-      <w:r>
-        <w:rPr>
-          <w:b/>
-          <w:bCs/>
-        </w:rPr>
-        <w:t xml:space="preserve">biztonságosan, láthatóan és bármikor visszavonhatóan delegálhassa</w:t>
-      </w:r>
-      <w:r>
-        <w:t xml:space="preserve"> az általa választott szoftvernek, a jelszava átadása nélkül.</w:t>
-      </w:r>
-    </w:p>
-    <w:p>
-      <w:pPr>
-        <w:spacing w:after="140"/>
-        <w:jc w:val="both"/>
-      </w:pPr>
-      <w:r>
-        <w:rPr>
-          <w:b/>
-          <w:bCs/>
-        </w:rPr>
-        <w:t xml:space="preserve">A felhasználó jogosultsága nem változik; az új kockázat abból fakad, hogy a felhatalmazott szoftver is hozzáfér az adathoz, majd azt tovább kezeli.</w:t>
-      </w:r>
-      <w:r>
-        <w:t xml:space="preserve"> Aki ma a KRÉTA-ban látja a gyermeke jegyeit, holnap is ugyanazokat fogja látni. Ami új, az az, hogy rajta kívül egy program is megkapja őket, és azokkal kezd valamit: továbbküldheti egy MI-szolgáltatónak, tárolhatja, esetleg az Unión kívülre viheti. A javaslat súlypontja ezért a felhasználás szabályozásán van.</w:t>
-      </w:r>
-    </w:p>
-    <w:p>
-      <w:pPr>
-        <w:spacing w:after="140"/>
-        <w:jc w:val="both"/>
-      </w:pPr>
-      <w:r>
-        <w:t xml:space="preserve">Négy dolgot javaslunk:</w:t>
-      </w:r>
-    </w:p>
-    <w:p>
-      <w:pPr>
-        <w:pStyle w:val="ListParagraph"/>
-        <w:numPr>
-          <w:ilvl w:val="0"/>
-          <w:numId w:val="2"/>
-        </w:numPr>
-        <w:spacing w:after="60"/>
-      </w:pPr>
-      <w:r>
-        <w:rPr>
-          <w:b/>
-          <w:bCs/>
-        </w:rPr>
-        <w:t xml:space="preserve">Új ágazati jogosultság</w:t>
-      </w:r>
-      <w:r>
-        <w:t xml:space="preserve"> a köznevelési és a felsőoktatási törvényben a meglévő hozzáférés delegálására — az érintett saját adatkörére, és külön, szigorúbb szabállyal az intézményi feladatkörben gyakorolt jogosultságra.</w:t>
-      </w:r>
-    </w:p>
-    <w:p>
-      <w:pPr>
-        <w:pStyle w:val="ListParagraph"/>
-        <w:numPr>
-          <w:ilvl w:val="0"/>
-          <w:numId w:val="2"/>
-        </w:numPr>
-        <w:spacing w:after="60"/>
-      </w:pPr>
-      <w:r>
-        <w:rPr>
-          <w:b/>
-          <w:bCs/>
-        </w:rPr>
-        <w:t xml:space="preserve">Nyilvános, dokumentált, verziózott programozói felület</w:t>
-      </w:r>
-      <w:r>
-        <w:t xml:space="preserve">, tesztkörnyezettel; ugyanaz a felület, amelyet a hivatalos alkalmazások ma is használnak.</w:t>
-      </w:r>
-    </w:p>
-    <w:p>
-      <w:pPr>
-        <w:pStyle w:val="ListParagraph"/>
-        <w:numPr>
-          <w:ilvl w:val="0"/>
-          <w:numId w:val="2"/>
-        </w:numPr>
-        <w:spacing w:after="60"/>
-      </w:pPr>
-      <w:r>
-        <w:rPr>
-          <w:b/>
-          <w:bCs/>
-        </w:rPr>
-        <w:t xml:space="preserve">Kockázatarányos bizalmi keret</w:t>
-      </w:r>
-      <w:r>
-        <w:t xml:space="preserve">: a felhatalmazható szoftverek háromszintű nyilvántartása, ahol a jogosultság mértéke a bizalmi szinthez kötött.</w:t>
-      </w:r>
-    </w:p>
-    <w:p>
-      <w:pPr>
-        <w:pStyle w:val="ListParagraph"/>
-        <w:numPr>
-          <w:ilvl w:val="0"/>
-          <w:numId w:val="2"/>
-        </w:numPr>
-        <w:spacing w:after="60"/>
-      </w:pPr>
-      <w:r>
-        <w:rPr>
-          <w:b/>
-          <w:bCs/>
-        </w:rPr>
-        <w:t xml:space="preserve">Felhasználási réteg</w:t>
-      </w:r>
-      <w:r>
-        <w:t xml:space="preserve">: a felhasználó emberi nyelven kapjon tájékoztatást arról, mi történik az adatával a kiadás után, és külön szabály mondja meg, milyen oktatási adatkör vihető egyáltalán tovább külső szolgáltatóhoz.</w:t>
-      </w:r>
-    </w:p>
-    <w:p>
-      <w:pPr>
-        <w:pStyle w:val="Heading2"/>
-        <w:spacing w:after="160" w:before="320"/>
-      </w:pPr>
-      <w:r>
-        <w:t xml:space="preserve">Mit nem állítunk</w:t>
-      </w:r>
-    </w:p>
-    <w:p>
-      <w:pPr>
-        <w:spacing w:after="140"/>
-        <w:jc w:val="both"/>
-      </w:pPr>
-      <w:r>
-        <w:t xml:space="preserve">Ezt a listát azért tesszük az előterjesztés elejére, mert a javaslattal szembeni ellenérvek többsége nem magát a javaslatot, hanem annak túlfogalmazását szokta célozni.</w:t>
-      </w:r>
-    </w:p>
-    <w:p>
-      <w:pPr>
-        <w:pStyle w:val="ListParagraph"/>
-        <w:numPr>
-          <w:ilvl w:val="0"/>
-          <w:numId w:val="1"/>
-        </w:numPr>
-        <w:spacing w:after="60"/>
-      </w:pPr>
-      <w:r>
-        <w:rPr>
-          <w:b/>
-          <w:bCs/>
-        </w:rPr>
-        <w:t xml:space="preserve">Nem javasoljuk a jogosultsági kör bővítését.</w:t>
-      </w:r>
-      <w:r>
-        <w:t xml:space="preserve"> Senki nem lát többet, mint ma; a csatorna változik, nem a jogosultság.</w:t>
-      </w:r>
-    </w:p>
-    <w:p>
-      <w:pPr>
-        <w:pStyle w:val="ListParagraph"/>
-        <w:numPr>
-          <w:ilvl w:val="0"/>
-          <w:numId w:val="1"/>
-        </w:numPr>
-        <w:spacing w:after="60"/>
-      </w:pPr>
-      <w:r>
-        <w:rPr>
-          <w:b/>
-          <w:bCs/>
-        </w:rPr>
-        <w:t xml:space="preserve">Nem állítjuk, hogy az érintettnek tulajdonjoga van a róla kezelt adatokon.</w:t>
-      </w:r>
-      <w:r>
-        <w:t xml:space="preserve"> Az uniós adatvédelmi jog nem ismer adat-tulajdonjogot; a „saját oktatási adat” a címben köznyelvi fordulat.</w:t>
-      </w:r>
-    </w:p>
-    <w:p>
-      <w:pPr>
-        <w:pStyle w:val="ListParagraph"/>
-        <w:numPr>
-          <w:ilvl w:val="0"/>
-          <w:numId w:val="1"/>
-        </w:numPr>
-        <w:spacing w:after="60"/>
-      </w:pPr>
-      <w:r>
-        <w:rPr>
-          <w:b/>
-          <w:bCs/>
-        </w:rPr>
-        <w:t xml:space="preserve">Nem állítjuk, hogy a javasolt jogosultság a hatályos jogból levezethető.</w:t>
-      </w:r>
-      <w:r>
-        <w:t xml:space="preserve"> Amit javaslunk, </w:t>
-      </w:r>
-      <w:r>
-        <w:rPr>
-          <w:b/>
-          <w:bCs/>
-        </w:rPr>
-        <w:t xml:space="preserve">új ágazati jogosultság</w:t>
-      </w:r>
-      <w:r>
-        <w:t xml:space="preserve"> (3.1–3.2). Ezt vállaljuk, nem álcázzuk meglévő jog technikai megvalósításának. Az MI-rendelet és az adatrendelet irányjelző, nem jogalap (3.4–3.5).</w:t>
-      </w:r>
-    </w:p>
-    <w:p>
-      <w:pPr>
-        <w:pStyle w:val="ListParagraph"/>
-        <w:numPr>
-          <w:ilvl w:val="0"/>
-          <w:numId w:val="1"/>
-        </w:numPr>
-        <w:spacing w:after="60"/>
-      </w:pPr>
-      <w:r>
-        <w:rPr>
-          <w:b/>
-          <w:bCs/>
-        </w:rPr>
-        <w:t xml:space="preserve">Nem javasoljuk, hogy ellenőrzés nélkül regisztrált szoftver írási műveletet végezhessen</w:t>
-      </w:r>
-      <w:r>
-        <w:t xml:space="preserve">, sem azt, hogy a pedagógus saját elhatározásából engedhesse át szoftvernek a munkaköri jogosultságát.</w:t>
-      </w:r>
-    </w:p>
-    <w:p>
-      <w:pPr>
-        <w:pStyle w:val="ListParagraph"/>
-        <w:numPr>
-          <w:ilvl w:val="0"/>
-          <w:numId w:val="1"/>
-        </w:numPr>
-        <w:spacing w:after="60"/>
-      </w:pPr>
-      <w:r>
-        <w:rPr>
-          <w:b/>
-          <w:bCs/>
-        </w:rPr>
-        <w:t xml:space="preserve">Nem állítjuk, hogy bármilyen oktatási adat szabadon továbbítható külső MI-szolgáltatóhoz.</w:t>
-      </w:r>
-      <w:r>
-        <w:t xml:space="preserve"> A melléklet M4. fejezete ennek az ellenkezőjét javasolja.</w:t>
-      </w:r>
-    </w:p>
-    <w:p>
-      <w:pPr>
-        <w:pStyle w:val="ListParagraph"/>
-        <w:numPr>
-          <w:ilvl w:val="0"/>
-          <w:numId w:val="1"/>
-        </w:numPr>
-        <w:spacing w:after="60"/>
-      </w:pPr>
-      <w:r>
-        <w:rPr>
-          <w:b/>
-          <w:bCs/>
-        </w:rPr>
-        <w:t xml:space="preserve">Nem állítjuk, hogy a rendszerek jelenlegi működése jogsértő.</w:t>
-      </w:r>
-      <w:r>
-        <w:t xml:space="preserve"> A javaslat egy új csatornára vonatkozó szabályozást kér, nem a hatályos gyakorlat minősítését. Ahol a melléklet M4.3 pontja szerinti besorolás szűkebb annál, mint amit a hivatalos felület ma megjelenít, az azért van, mert </w:t>
-      </w:r>
-      <w:r>
-        <w:rPr>
-          <w:b/>
-          <w:bCs/>
-        </w:rPr>
-        <w:t xml:space="preserve">az automatizált, ismételt lekérdezés más kitettséget jelent, mint az alkalmi kézi megtekintés</w:t>
-      </w:r>
-      <w:r>
-        <w:t xml:space="preserve"> — nem azért, mert a mai megjelenítést jogellenesnek tartanánk. Ennek megítélése az adatvédelmi hatóság és a bíróság hatásköre.</w:t>
-      </w:r>
-    </w:p>
-    <w:p>
-      <w:pPr>
-        <w:pBdr>
-          <w:bottom w:val="single" w:color="B0B8C4" w:sz="6"/>
-        </w:pBdr>
-        <w:spacing w:after="200" w:before="200"/>
-      </w:pPr>
-      <w:r>
-        <w:t xml:space="preserve"/>
-      </w:r>
-    </w:p>
-    <w:p>
-      <w:pPr>
-        <w:pStyle w:val="Heading1"/>
-        <w:spacing w:after="160" w:before="320"/>
-      </w:pPr>
-      <w:r>
-        <w:t xml:space="preserve">1. Probléma</w:t>
-      </w:r>
-    </w:p>
-    <w:p>
-      <w:pPr>
-        <w:pStyle w:val="Heading2"/>
-        <w:spacing w:after="160" w:before="320"/>
-      </w:pPr>
-      <w:r>
-        <w:t xml:space="preserve">1.1 A probléma nem az appok hiánya, hanem a széttöredezettség</w:t>
-      </w:r>
-    </w:p>
-    <w:p>
-      <w:pPr>
-        <w:spacing w:after="140"/>
-        <w:jc w:val="both"/>
-      </w:pPr>
-      <w:r>
-        <w:t xml:space="preserve">Az előterjesztést könnyű félreérteni úgy, hogy „hiányzik az MI-integráció az oktatásból”. A hiány valódi, de nem ez a probléma gyökere. A gyökér az, hogy a felhasználó digitális élete rendszerekre van szabdalva, és a rendszerek közti átjárást neki magának kell elvégeznie.</w:t>
-      </w:r>
-    </w:p>
-    <w:p>
-      <w:pPr>
-        <w:spacing w:after="140"/>
-        <w:jc w:val="both"/>
-      </w:pPr>
-      <w:r>
-        <w:rPr>
-          <w:b/>
-          <w:bCs/>
-        </w:rPr>
-        <w:t xml:space="preserve">A szülő oldalán</w:t>
-      </w:r>
-      <w:r>
-        <w:t xml:space="preserve"> ez így néz ki. Külön alkalmazás a munkahelyi levelezéshez, külön a bankhoz, a parkoláshoz, az egészségügyi időpontokhoz, a közműszámlákhoz, a háztartási gépekhez, a tévéhez, az okosotthonhoz. Ezek mellé jön az iskolai alkalmazás — és ha két gyerek van, akkor több fiók, több felület, több értesítés és több napi rutin. A szülő nem még egy alkalmazást akar használni. Azt szeretné, hogy a már használt eszközében feltehessen egy kérdést:</w:t>
+        <w:t xml:space="preserve">„Mi van ezen a héten a két gyerekkel? Mi a házi, mik a számonkérések, van-e valami, amire figyelnem kell?"</w:t>
+      </w:r>
+    </w:p>
+    <w:p>
+      <w:pPr>
+        <w:spacing w:after="140"/>
+        <w:jc w:val="both"/>
+      </w:pPr>
+      <w:r>
+        <w:t xml:space="preserve">A pedagógus ugyanezt éli meg, más szerepben. A napló az egyik rendszerben van, a kommunikáció a másikban, az órarend a harmadikban, a tananyag és a beadandók egy tanulásszervezési rendszerben, emellett e-mail, megosztott dokumentumok és belső intézményi felületek. Ő is az egyikben nézi meg, mit lát, és viszi át a másikba. Az ő kérdése ez volna:</w:t>
       </w:r>
     </w:p>
     <w:p>
@@ -528,96 +247,16 @@
         <w:ind w:left="360"/>
       </w:pPr>
       <w:r>
-        <w:t xml:space="preserve">„Mi van ezen a héten a két gyerekkel? Mi a házi, mik a számonkérések, van-e valami, amire figyelnem kell?”</w:t>
-      </w:r>
-    </w:p>
-    <w:p>
-      <w:pPr>
-        <w:spacing w:after="140"/>
-        <w:jc w:val="both"/>
-      </w:pPr>
-      <w:r>
-        <w:rPr>
-          <w:b/>
-          <w:bCs/>
-        </w:rPr>
-        <w:t xml:space="preserve">A pedagógus oldalán</w:t>
-      </w:r>
-      <w:r>
-        <w:t xml:space="preserve"> ugyanez a probléma, más szerepben. A napló az egyik rendszerben van, a kommunikáció a másikban, az órarend a harmadikban, a tananyag és a beadandók egy tanulásszervezési rendszerben, emellett e-mail, megosztott dokumentumok és belső intézményi felületek. A pedagógus ugyanúgy az integrációs réteg: megnézi az egyikben, mit lát, és átviszi a másikba. Az ő kérdése ez volna:</w:t>
-      </w:r>
-    </w:p>
-    <w:p>
-      <w:pPr>
-        <w:pBdr>
-          <w:left w:val="single" w:color="6B7A8F" w:sz="12" w:space="12"/>
-        </w:pBdr>
-        <w:spacing w:after="60" w:before="60"/>
-        <w:ind w:left="360"/>
-      </w:pPr>
-      <w:r>
-        <w:t xml:space="preserve">„Kik maradtak le, kinek kell írnom, és mit kell ma adminisztrálnom?”</w:t>
-      </w:r>
-    </w:p>
-    <w:p>
-      <w:pPr>
-        <w:spacing w:after="140"/>
-        <w:jc w:val="both"/>
-      </w:pPr>
-      <w:r>
-        <w:rPr>
-          <w:b/>
-          <w:bCs/>
-        </w:rPr>
-        <w:t xml:space="preserve">Miért nem a jobb KRÉTA-app a válasz.</w:t>
-      </w:r>
-      <w:r>
-        <w:t xml:space="preserve"> Egy szebb, gyorsabb, okosabb hivatalos alkalmazás ezt nem oldja meg. Akármilyen jó, továbbra is </w:t>
-      </w:r>
-      <w:r>
-        <w:rPr>
-          <w:b/>
-          <w:bCs/>
-        </w:rPr>
-        <w:t xml:space="preserve">egy újabb felület</w:t>
-      </w:r>
-      <w:r>
-        <w:t xml:space="preserve">, amelyet meg kell nyitni, amelyben külön kell keresni, és amely nem tud mit kezdeni azzal, hogy a szülőnek két gyereke van két iskolában, vagy hogy a pedagógus a leveleit máshol olvassa. A „még egy app” logika minden újabb körrel súlyosbítja azt a problémát, amelyet enyhíteni akar.</w:t>
-      </w:r>
-    </w:p>
-    <w:p>
-      <w:pPr>
-        <w:spacing w:after="140"/>
-        <w:jc w:val="both"/>
-      </w:pPr>
-      <w:r>
-        <w:t xml:space="preserve">A cél tehát nem az, hogy legyen egy jobb KRÉTA-app, hanem hogy </w:t>
-      </w:r>
-      <w:r>
-        <w:rPr>
-          <w:b/>
-          <w:bCs/>
-        </w:rPr>
-        <w:t xml:space="preserve">a KRÉTA-adat ne legyen egyetlen felületbe bezárva</w:t>
-      </w:r>
-      <w:r>
-        <w:t xml:space="preserve">.</w:t>
-      </w:r>
-    </w:p>
-    <w:p>
-      <w:pPr>
-        <w:spacing w:after="140"/>
-        <w:jc w:val="both"/>
-      </w:pPr>
-      <w:r>
-        <w:rPr>
-          <w:b/>
-          <w:bCs/>
-        </w:rPr>
-        <w:t xml:space="preserve">Az elv egy mondatban:</w:t>
-      </w:r>
-      <w:r>
-        <w:t xml:space="preserve"> ne az ember legyen az integrációs réteg a rendszerek között.</w:t>
+        <w:t xml:space="preserve">„Kik maradtak le, kinek kell írnom, és mit kell ma adminisztrálnom?"</w:t>
+      </w:r>
+    </w:p>
+    <w:p>
+      <w:pPr>
+        <w:spacing w:after="140"/>
+        <w:jc w:val="both"/>
+      </w:pPr>
+      <w:r>
+        <w:t xml:space="preserve">Egy szebb és gyorsabb hivatalos alkalmazás ezen keveset változtatna, mert az is egy újabb felület, amelyet meg kell nyitni, amelyben külön kell keresni, és amely önmagában nem tud mit kezdeni azzal, hogy a szülőnek két gyereke van két iskolában, vagy hogy a pedagógus a leveleit máshol olvassa. Minden újabb alkalmazás azt a terhet növeli, amelyen enyhíteni akar. A cél ezért az, hogy a KRÉTA adata elérhető legyen azon az eszközön is, amelyet a felhasználó már amúgy is használ.</w:t>
       </w:r>
     </w:p>
     <w:p>
@@ -626,55 +265,25 @@
         <w:spacing w:after="160" w:before="320"/>
       </w:pPr>
       <w:r>
-        <w:t xml:space="preserve">1.2 A hozzáférés megvan; a csatorna hiányzik</w:t>
-      </w:r>
-    </w:p>
-    <w:p>
-      <w:pPr>
-        <w:spacing w:after="140"/>
-        <w:jc w:val="both"/>
-      </w:pPr>
-      <w:r>
-        <w:t xml:space="preserve">A szülő ma belép a KRÉTA-ba, és látja a gyermeke jegyeit, hiányzásait, órarendjét, számonkéréseit. A tanuló ugyanezt a sajátjára, a hallgató a Neptunban a vizsgáit. Ez a hozzáférés </w:t>
-      </w:r>
-      <w:r>
-        <w:rPr>
-          <w:b/>
-          <w:bCs/>
-        </w:rPr>
-        <w:t xml:space="preserve">létezik, jogszerű és megszokott</w:t>
-      </w:r>
-      <w:r>
-        <w:t xml:space="preserve">; egyetlen korlátja, hogy kizárólag az üzemeltető által kiadott alkalmazáson keresztül gyakorolható. A jogosult felhasználó hozzáférésének ténye önmagában nem indokolja ezt a kizárólagosságot. A korlát oka technikai: a belépési rendszer nem teszi lehetővé, hogy harmadik fél szoftvere a felhasználó engedélyével kapcsolódjon.</w:t>
-      </w:r>
-    </w:p>
-    <w:p>
-      <w:pPr>
-        <w:spacing w:after="140"/>
-        <w:jc w:val="both"/>
-      </w:pPr>
-      <w:r>
-        <w:t xml:space="preserve">Ebből következik, hogy a javaslat </w:t>
-      </w:r>
-      <w:r>
-        <w:rPr>
-          <w:b/>
-          <w:bCs/>
-        </w:rPr>
-        <w:t xml:space="preserve">egyetlen adatmezőt sem tesz elérhetővé olyan személy számára, aki ma nem látja</w:t>
-      </w:r>
-      <w:r>
-        <w:t xml:space="preserve">. A delegált hozzáférés a felhasználó meglévő jogosultságára épül, és annál szűkebb is lehet, mert a felhasználó szűkítheti. A leggyakoribb félreértés az, hogy „megnyitjuk a KRÉTA-t”. A KRÉTA ma is nyitva van a jogosult felhasználó felé, egyetlen csatornán; a javaslat a csatornát teszi választhatóvá, és cserébe </w:t>
-      </w:r>
-      <w:r>
-        <w:rPr>
-          <w:b/>
-          <w:bCs/>
-        </w:rPr>
-        <w:t xml:space="preserve">láthatóvá és visszavonhatóvá</w:t>
-      </w:r>
-      <w:r>
-        <w:t xml:space="preserve"> azt, ami ma jelszóátadással, láthatatlanul történik.</w:t>
+        <w:t xml:space="preserve">1.2 A hozzáférés megvan, a csatorna hiányzik</w:t>
+      </w:r>
+    </w:p>
+    <w:p>
+      <w:pPr>
+        <w:spacing w:after="140"/>
+        <w:jc w:val="both"/>
+      </w:pPr>
+      <w:r>
+        <w:t xml:space="preserve">A hozzáférés ma is létezik és megszokott, azzal a korláttal, hogy kizárólag az üzemeltető által kiadott alkalmazáson keresztül gyakorolható. A kizárólagosságnak technikai oka van: a belépési rendszer nem teszi lehetővé, hogy harmadik fél szoftvere a felhasználó engedélyével kapcsolódjon. A jogosult felhasználó hozzáférésének ténye önmagában nem indokolja a fenntartását.</w:t>
+      </w:r>
+    </w:p>
+    <w:p>
+      <w:pPr>
+        <w:spacing w:after="140"/>
+        <w:jc w:val="both"/>
+      </w:pPr>
+      <w:r>
+        <w:t xml:space="preserve">Ebből következik, hogy a javaslat egyetlen adatmezőt sem tesz elérhetővé olyan személy számára, aki ma nem látja. A delegált hozzáférés a felhasználó meglévő jogosultságára épül, és annál szűkebb is lehet, mert a felhasználó maga szűkítheti. A KRÉTA ma is nyitva áll a jogosult felhasználó felé, egyetlen csatornán; a javaslat ezt a csatornát teszi választhatóvá, és cserébe láthatóvá és visszavonhatóvá teszi azt, ami ma jelszóátadással, a rendszer számára észrevétlenül történik.</w:t>
       </w:r>
     </w:p>
     <w:p>
@@ -683,44 +292,79 @@
         <w:spacing w:after="160" w:before="320"/>
       </w:pPr>
       <w:r>
-        <w:t xml:space="preserve">1.3 Ami valóban új: az adat további útja</w:t>
-      </w:r>
-    </w:p>
-    <w:p>
-      <w:pPr>
-        <w:spacing w:after="140"/>
-        <w:jc w:val="both"/>
-      </w:pPr>
-      <w:r>
-        <w:t xml:space="preserve">Ha a szülő a saját asszisztensével nézi meg a gyermeke jegyeit, akkor az adat elhagyja a KRÉTA-t, és egy másik rendszerbe kerül. Ez a különbség a mai állapothoz képest — nem a hozzáférés, hanem a </w:t>
-      </w:r>
-      <w:r>
-        <w:rPr>
-          <w:b/>
-          <w:bCs/>
-        </w:rPr>
-        <w:t xml:space="preserve">továbbhaladás</w:t>
-      </w:r>
-      <w:r>
-        <w:t xml:space="preserve">.</w:t>
-      </w:r>
-    </w:p>
-    <w:p>
-      <w:pPr>
-        <w:spacing w:after="140"/>
-        <w:jc w:val="both"/>
-      </w:pPr>
-      <w:r>
-        <w:t xml:space="preserve">Ez a kockázat ma is fennáll, csak szabályozatlanul: a szülő kimásolja a képernyőt és bemásolja egy MI-asszisztensbe, vagy jelszót ad egy közvetítő szolgáltatásnak. A különbség az, hogy ma erről senki nem tájékoztatja, senki nem tartja nyilván, és senki nem tudja visszavonni.</w:t>
-      </w:r>
-    </w:p>
-    <w:p>
-      <w:pPr>
-        <w:spacing w:after="140"/>
-        <w:jc w:val="both"/>
-      </w:pPr>
-      <w:r>
-        <w:t xml:space="preserve">A javaslat ezért két rétegből áll:</w:t>
+        <w:t xml:space="preserve">1.3 Az adat további útja</w:t>
+      </w:r>
+    </w:p>
+    <w:p>
+      <w:pPr>
+        <w:spacing w:after="140"/>
+        <w:jc w:val="both"/>
+      </w:pPr>
+      <w:r>
+        <w:t xml:space="preserve">Ha a szülő a saját asszisztensével nézi meg a gyermeke jegyeit, az adat elhagyja a KRÉTA-t, és egy másik rendszerbe kerül. Ez a valódi újdonság a mai állapothoz képest.</w:t>
+      </w:r>
+    </w:p>
+    <w:p>
+      <w:pPr>
+        <w:spacing w:after="140"/>
+        <w:jc w:val="both"/>
+      </w:pPr>
+      <w:r>
+        <w:t xml:space="preserve">A kockázat ma is fennáll, csak szabályozatlanul. A szülő kimásolja a képernyő tartalmát és bemásolja egy MI-asszisztensbe, vagy jelszót ad egy közvetítő szolgáltatásnak. Ilyenkor senki nem tájékoztatja arról, hová kerül az adat, a hozzáférés sehol nem jelenik meg nyilvántartásban, és visszavonni sem lehet.</w:t>
+      </w:r>
+    </w:p>
+    <w:p>
+      <w:pPr>
+        <w:spacing w:after="140"/>
+        <w:jc w:val="both"/>
+      </w:pPr>
+      <w:r>
+        <w:t xml:space="preserve">A javaslat ezért két rétegben gondolkodik. A hozzáférési réteg azt szabályozza, ki kaphat felhatalmazást és milyen műveletre; ezt a melléklet M3. fejezete fejti ki. A felhasználási réteg azt, hogy mi történik az adattal azután, és miről kell a felhasználót tájékoztatni; ez a melléklet M4. fejezete. A második réteg nélkül a szabályozás a valódi kockázatot hagyná érintetlenül.</w:t>
+      </w:r>
+    </w:p>
+    <w:p>
+      <w:pPr>
+        <w:pStyle w:val="Heading2"/>
+        <w:spacing w:after="160" w:before="320"/>
+      </w:pPr>
+      <w:r>
+        <w:t xml:space="preserve">1.4 Dokumentált tények</w:t>
+      </w:r>
+    </w:p>
+    <w:p>
+      <w:pPr>
+        <w:spacing w:after="140"/>
+        <w:jc w:val="both"/>
+      </w:pPr>
+      <w:r>
+        <w:t xml:space="preserve">Az adatot ma csak a hivatalos alkalmazás éri el. A KRÉTA a szülőnek, a tanulónak és a pedagógusnak külön mobilalkalmazást kínál, amelyekben órarend, számonkérések, házi feladatok, jegyek és mulasztások jelennek meg, a pedagógus pedig naplózási és értékelési műveleteket is végezhet. Az alkalmazások mögött tehát működő programozói felület áll, amelyet azonban kizárólag a hivatalos alkalmazás használhat: a belépési rendszer nem teszi lehetővé, hogy harmadik fél szoftvere a felhasználó engedélyével klienst regisztráljon, és a felület dokumentációja nem nyilvános.</w:t>
+      </w:r>
+    </w:p>
+    <w:p>
+      <w:pPr>
+        <w:spacing w:after="140"/>
+        <w:jc w:val="both"/>
+      </w:pPr>
+      <w:r>
+        <w:t xml:space="preserve">Az üzemeltető a nem hivatalos kliens használatát kifejezetten rendellenesnek minősíti. A KRÉTA saját tudásbázisa szerint rendellenes működésnek minősülhet, ha ugyanazt a profilt nem hivatalos alkalmazás használja. [ELLENŐRIZENDŐ: a tudásbázis-cikk pontos címe, URL-je és lekérdezési dátuma] Ennek az az önmagán túlmutató jelentősége, hogy a zártság szándékolt üzemeltetői álláspont, amely jogszabályi beavatkozás nélkül várhatóan fennmarad.</w:t>
+      </w:r>
+    </w:p>
+    <w:p>
+      <w:pPr>
+        <w:spacing w:after="140"/>
+        <w:jc w:val="both"/>
+      </w:pPr>
+      <w:r>
+        <w:t xml:space="preserve">A felsőoktatásban a hivatalos mobilcsatorna megszűnt. A Neptun hivatalos mobilalkalmazása 2023. október 19-én, a kétfaktoros belépés bevezetésekor szűnt meg. Egyes egyetemek saját alkalmazásai, például a Magyar Agrár- és Élettudományi Egyetem MyMATE és a Debreceni Egyetem UD Studyversity alkalmazása, továbbra is megjelenítik a hallgatók Neptun-adatait. A felület tehát létezik, és intézményi alkalmazások használják is, de a hallgató és az oktató saját eszköze nem kapcsolódhat hozzá.</w:t>
+      </w:r>
+    </w:p>
+    <w:p>
+      <w:pPr>
+        <w:pStyle w:val="Heading2"/>
+        <w:spacing w:after="160" w:before="320"/>
+      </w:pPr>
+      <w:r>
+        <w:t xml:space="preserve">1.5 Az érintettek</w:t>
       </w:r>
     </w:p>
     <w:tbl>
@@ -766,7 +410,7 @@
                 <w:sz w:val="18"/>
                 <w:szCs w:val="18"/>
               </w:rPr>
-              <w:t xml:space="preserve">Réteg</w:t>
+              <w:t xml:space="preserve">Érintett csoport</w:t>
             </w:r>
           </w:p>
         </w:tc>
@@ -792,7 +436,7 @@
                 <w:sz w:val="18"/>
                 <w:szCs w:val="18"/>
               </w:rPr>
-              <w:t xml:space="preserve">Kérdés</w:t>
+              <w:t xml:space="preserve">Létszám</w:t>
             </w:r>
           </w:p>
         </w:tc>
@@ -818,7 +462,7 @@
                 <w:sz w:val="18"/>
                 <w:szCs w:val="18"/>
               </w:rPr>
-              <w:t xml:space="preserve">Hol</w:t>
+              <w:t xml:space="preserve">Forrás</w:t>
             </w:r>
           </w:p>
         </w:tc>
@@ -843,12 +487,10 @@
             </w:pPr>
             <w:r>
               <w:rPr>
-                <w:b/>
-                <w:bCs/>
-                <w:sz w:val="18"/>
-                <w:szCs w:val="18"/>
-              </w:rPr>
-              <w:t xml:space="preserve">Hozzáférési réteg</w:t>
+                <w:sz w:val="18"/>
+                <w:szCs w:val="18"/>
+              </w:rPr>
+              <w:t xml:space="preserve">nappali rendszerű általános iskolai tanulók</w:t>
             </w:r>
           </w:p>
         </w:tc>
@@ -871,7 +513,7 @@
                 <w:sz w:val="18"/>
                 <w:szCs w:val="18"/>
               </w:rPr>
-              <w:t xml:space="preserve">Ki kaphat felhatalmazást, és milyen műveletre?</w:t>
+              <w:t xml:space="preserve">kb. 710 000 fő</w:t>
             </w:r>
           </w:p>
         </w:tc>
@@ -894,7 +536,7 @@
                 <w:sz w:val="18"/>
                 <w:szCs w:val="18"/>
               </w:rPr>
-              <w:t xml:space="preserve">Melléklet, M3.</w:t>
+              <w:t xml:space="preserve">KSH, 2024/2025, előzetes</w:t>
             </w:r>
           </w:p>
         </w:tc>
@@ -919,12 +561,10 @@
             </w:pPr>
             <w:r>
               <w:rPr>
-                <w:b/>
-                <w:bCs/>
-                <w:sz w:val="18"/>
-                <w:szCs w:val="18"/>
-              </w:rPr>
-              <w:t xml:space="preserve">Felhasználási réteg</w:t>
+                <w:sz w:val="18"/>
+                <w:szCs w:val="18"/>
+              </w:rPr>
+              <w:t xml:space="preserve">általános iskolai pedagógusok</w:t>
             </w:r>
           </w:p>
         </w:tc>
@@ -947,7 +587,7 @@
                 <w:sz w:val="18"/>
                 <w:szCs w:val="18"/>
               </w:rPr>
-              <w:t xml:space="preserve">Mi történik az adattal azután, és miről kell a felhasználót tájékoztatni?</w:t>
+              <w:t xml:space="preserve">kb. 74 000 fő</w:t>
             </w:r>
           </w:p>
         </w:tc>
@@ -970,202 +610,7 @@
                 <w:sz w:val="18"/>
                 <w:szCs w:val="18"/>
               </w:rPr>
-              <w:t xml:space="preserve">Melléklet, M4.</w:t>
-            </w:r>
-          </w:p>
-        </w:tc>
-      </w:tr>
-    </w:tbl>
-    <w:p>
-      <w:pPr>
-        <w:spacing w:after="160"/>
-      </w:pPr>
-      <w:r>
-        <w:t xml:space="preserve"/>
-      </w:r>
-    </w:p>
-    <w:p>
-      <w:pPr>
-        <w:spacing w:after="140"/>
-        <w:jc w:val="both"/>
-      </w:pPr>
-      <w:r>
-        <w:t xml:space="preserve">A második réteg nélkül a javaslat a valódi kockázatot hagyná szabályozatlanul. Mindkét réteget a melléklet fejti ki.</w:t>
-      </w:r>
-    </w:p>
-    <w:p>
-      <w:pPr>
-        <w:pBdr>
-          <w:bottom w:val="single" w:color="B0B8C4" w:sz="6"/>
-        </w:pBdr>
-        <w:spacing w:after="200" w:before="200"/>
-      </w:pPr>
-      <w:r>
-        <w:t xml:space="preserve"/>
-      </w:r>
-    </w:p>
-    <w:p>
-      <w:pPr>
-        <w:pStyle w:val="Heading2"/>
-        <w:spacing w:after="160" w:before="320"/>
-      </w:pPr>
-      <w:r>
-        <w:t xml:space="preserve">1.4 Dokumentált tények</w:t>
-      </w:r>
-    </w:p>
-    <w:p>
-      <w:pPr>
-        <w:spacing w:after="140"/>
-        <w:jc w:val="both"/>
-      </w:pPr>
-      <w:r>
-        <w:rPr>
-          <w:b/>
-          <w:bCs/>
-        </w:rPr>
-        <w:t xml:space="preserve">Az adatot ma csak a hivatalos alkalmazás éri el.</w:t>
-      </w:r>
-      <w:r>
-        <w:t xml:space="preserve"> A KRÉTA a szülőnek, a tanulónak és a pedagógusnak külön hivatalos mobilalkalmazást kínál. Ezekben órarend, számonkérések, házi feladatok, jegyek és mulasztások jelennek meg; a pedagógus naplózási és értékelési műveleteket is végezhet. Az alkalmazások mögött tehát működő programozói felület áll — amelyet azonban kizárólag a hivatalos alkalmazás használhat: a belépési rendszer nem teszi lehetővé, hogy harmadik fél szoftvere a felhasználó engedélyével klienst regisztráljon, és a felület dokumentációja nem nyilvános.</w:t>
-      </w:r>
-    </w:p>
-    <w:p>
-      <w:pPr>
-        <w:spacing w:after="140"/>
-        <w:jc w:val="both"/>
-      </w:pPr>
-      <w:r>
-        <w:rPr>
-          <w:b/>
-          <w:bCs/>
-        </w:rPr>
-        <w:t xml:space="preserve">Az üzemeltető a nem hivatalos kliens használatát kifejezetten rendellenesnek minősíti.</w:t>
-      </w:r>
-      <w:r>
-        <w:t xml:space="preserve"> A KRÉTA saját tudásbázisa szerint rendellenes működésnek minősülhet, ha ugyanazt a profilt nem hivatalos alkalmazás használja. [ELLENŐRIZENDŐ: a tudásbázis-cikk pontos címe, URL-je és lekérdezési dátuma] Ez azért fontos, mert megmutatja: a zártság nem műszaki mellékhatás, hanem szándékolt üzemeltetői álláspont — tehát jogszabály nélkül nem fog megváltozni.</w:t>
-      </w:r>
-    </w:p>
-    <w:p>
-      <w:pPr>
-        <w:spacing w:after="140"/>
-        <w:jc w:val="both"/>
-      </w:pPr>
-      <w:r>
-        <w:rPr>
-          <w:b/>
-          <w:bCs/>
-        </w:rPr>
-        <w:t xml:space="preserve">A felsőoktatásban a hivatalos mobilcsatorna megszűnt.</w:t>
-      </w:r>
-      <w:r>
-        <w:t xml:space="preserve"> A Neptun hivatalos mobilalkalmazása 2023. október 19-én, a kétfaktoros belépés bevezetésekor megszűnt. Egyes egyetemek saját alkalmazásai — például a Magyar Agrár- és Élettudományi Egyetem MyMATE és a Debreceni Egyetem UD Studyversity alkalmazása — továbbra is megjelenítik a hallgatók Neptun-adatait. A felület tehát létezik, és intézményi alkalmazások használják is; a hallgató és az oktató saját eszköze viszont nem kapcsolódhat hozzá.</w:t>
-      </w:r>
-    </w:p>
-    <w:p>
-      <w:pPr>
-        <w:pStyle w:val="Heading2"/>
-        <w:spacing w:after="160" w:before="320"/>
-      </w:pPr>
-      <w:r>
-        <w:t xml:space="preserve">1.5 Az érintettek</w:t>
-      </w:r>
-    </w:p>
-    <w:tbl>
-      <w:tblPr>
-        <w:tblW w:type="dxa" w:w="9026"/>
-        <w:tblBorders>
-          <w:top w:val="single" w:color="auto" w:sz="4"/>
-          <w:left w:val="single" w:color="auto" w:sz="4"/>
-          <w:bottom w:val="single" w:color="auto" w:sz="4"/>
-          <w:right w:val="single" w:color="auto" w:sz="4"/>
-          <w:insideH w:val="single" w:color="auto" w:sz="4"/>
-          <w:insideV w:val="single" w:color="auto" w:sz="4"/>
-        </w:tblBorders>
-      </w:tblPr>
-      <w:tblGrid>
-        <w:gridCol w:w="3008"/>
-        <w:gridCol w:w="3008"/>
-        <w:gridCol w:w="3010"/>
-      </w:tblGrid>
-      <w:tr>
-        <w:trPr>
-          <w:tblHeader/>
-        </w:trPr>
-        <w:tc>
-          <w:tcPr>
-            <w:tcW w:type="dxa" w:w="3008"/>
-            <w:shd w:fill="E8EDF3" w:val="clear"/>
-            <w:tcMar>
-              <w:top w:type="dxa" w:w="60"/>
-              <w:left w:type="dxa" w:w="100"/>
-              <w:bottom w:type="dxa" w:w="60"/>
-              <w:right w:type="dxa" w:w="100"/>
-            </w:tcMar>
-          </w:tcPr>
-          <w:p>
-            <w:pPr>
-              <w:spacing w:after="0" w:before="0"/>
-            </w:pPr>
-            <w:r>
-              <w:rPr>
-                <w:b/>
-                <w:bCs/>
-                <w:sz w:val="18"/>
-                <w:szCs w:val="18"/>
-              </w:rPr>
-              <w:t xml:space="preserve">Érintett csoport</w:t>
-            </w:r>
-          </w:p>
-        </w:tc>
-        <w:tc>
-          <w:tcPr>
-            <w:tcW w:type="dxa" w:w="3008"/>
-            <w:shd w:fill="E8EDF3" w:val="clear"/>
-            <w:tcMar>
-              <w:top w:type="dxa" w:w="60"/>
-              <w:left w:type="dxa" w:w="100"/>
-              <w:bottom w:type="dxa" w:w="60"/>
-              <w:right w:type="dxa" w:w="100"/>
-            </w:tcMar>
-          </w:tcPr>
-          <w:p>
-            <w:pPr>
-              <w:spacing w:after="0" w:before="0"/>
-            </w:pPr>
-            <w:r>
-              <w:rPr>
-                <w:b/>
-                <w:bCs/>
-                <w:sz w:val="18"/>
-                <w:szCs w:val="18"/>
-              </w:rPr>
-              <w:t xml:space="preserve">Létszám</w:t>
-            </w:r>
-          </w:p>
-        </w:tc>
-        <w:tc>
-          <w:tcPr>
-            <w:tcW w:type="dxa" w:w="3010"/>
-            <w:shd w:fill="E8EDF3" w:val="clear"/>
-            <w:tcMar>
-              <w:top w:type="dxa" w:w="60"/>
-              <w:left w:type="dxa" w:w="100"/>
-              <w:bottom w:type="dxa" w:w="60"/>
-              <w:right w:type="dxa" w:w="100"/>
-            </w:tcMar>
-          </w:tcPr>
-          <w:p>
-            <w:pPr>
-              <w:spacing w:after="0" w:before="0"/>
-            </w:pPr>
-            <w:r>
-              <w:rPr>
-                <w:b/>
-                <w:bCs/>
-                <w:sz w:val="18"/>
-                <w:szCs w:val="18"/>
-              </w:rPr>
-              <w:t xml:space="preserve">Forrás</w:t>
+              <w:t xml:space="preserve">KSH, 2024/2025, előzetes</w:t>
             </w:r>
           </w:p>
         </w:tc>
@@ -1193,7 +638,7 @@
                 <w:sz w:val="18"/>
                 <w:szCs w:val="18"/>
               </w:rPr>
-              <w:t xml:space="preserve">nappali rendszerű általános iskolai tanulók</w:t>
+              <w:t xml:space="preserve">középfokú iskolai pedagógusok, oktatók</w:t>
             </w:r>
           </w:p>
         </w:tc>
@@ -1216,7 +661,7 @@
                 <w:sz w:val="18"/>
                 <w:szCs w:val="18"/>
               </w:rPr>
-              <w:t xml:space="preserve">kb. 710 000 fő</w:t>
+              <w:t xml:space="preserve">kb. 43 000 fő</w:t>
             </w:r>
           </w:p>
         </w:tc>
@@ -1267,7 +712,7 @@
                 <w:sz w:val="18"/>
                 <w:szCs w:val="18"/>
               </w:rPr>
-              <w:t xml:space="preserve">általános iskolai pedagógusok</w:t>
+              <w:t xml:space="preserve">óvodapedagógusok</w:t>
             </w:r>
           </w:p>
         </w:tc>
@@ -1290,7 +735,7 @@
                 <w:sz w:val="18"/>
                 <w:szCs w:val="18"/>
               </w:rPr>
-              <w:t xml:space="preserve">kb. 74 000 fő</w:t>
+              <w:t xml:space="preserve">kb. 31 000 fő</w:t>
             </w:r>
           </w:p>
         </w:tc>
@@ -1341,7 +786,7 @@
                 <w:sz w:val="18"/>
                 <w:szCs w:val="18"/>
               </w:rPr>
-              <w:t xml:space="preserve">középfokú iskolai pedagógusok, oktatók</w:t>
+              <w:t xml:space="preserve">felsőoktatási hallgatók</w:t>
             </w:r>
           </w:p>
         </w:tc>
@@ -1364,7 +809,7 @@
                 <w:sz w:val="18"/>
                 <w:szCs w:val="18"/>
               </w:rPr>
-              <w:t xml:space="preserve">kb. 43 000 fő</w:t>
+              <w:t xml:space="preserve">kb. 351 000 fő</w:t>
             </w:r>
           </w:p>
         </w:tc>
@@ -1387,7 +832,7 @@
                 <w:sz w:val="18"/>
                 <w:szCs w:val="18"/>
               </w:rPr>
-              <w:t xml:space="preserve">KSH, 2024/2025, előzetes</w:t>
+              <w:t xml:space="preserve">KSH, 2025/2026, előzetes</w:t>
             </w:r>
           </w:p>
         </w:tc>
@@ -1415,7 +860,7 @@
                 <w:sz w:val="18"/>
                 <w:szCs w:val="18"/>
               </w:rPr>
-              <w:t xml:space="preserve">óvodapedagógusok</w:t>
+              <w:t xml:space="preserve">felsőoktatási oktatók</w:t>
             </w:r>
           </w:p>
         </w:tc>
@@ -1438,7 +883,7 @@
                 <w:sz w:val="18"/>
                 <w:szCs w:val="18"/>
               </w:rPr>
-              <w:t xml:space="preserve">kb. 31 000 fő</w:t>
+              <w:t xml:space="preserve">kb. 27 000 fő</w:t>
             </w:r>
           </w:p>
         </w:tc>
@@ -1461,7 +906,7 @@
                 <w:sz w:val="18"/>
                 <w:szCs w:val="18"/>
               </w:rPr>
-              <w:t xml:space="preserve">KSH, 2024/2025, előzetes</w:t>
+              <w:t xml:space="preserve">KSH, 2023/2024</w:t>
             </w:r>
           </w:p>
         </w:tc>
@@ -1489,154 +934,6 @@
                 <w:sz w:val="18"/>
                 <w:szCs w:val="18"/>
               </w:rPr>
-              <w:t xml:space="preserve">felsőoktatási hallgatók</w:t>
-            </w:r>
-          </w:p>
-        </w:tc>
-        <w:tc>
-          <w:tcPr>
-            <w:tcW w:type="dxa" w:w="3008"/>
-            <w:tcMar>
-              <w:top w:type="dxa" w:w="60"/>
-              <w:left w:type="dxa" w:w="100"/>
-              <w:bottom w:type="dxa" w:w="60"/>
-              <w:right w:type="dxa" w:w="100"/>
-            </w:tcMar>
-          </w:tcPr>
-          <w:p>
-            <w:pPr>
-              <w:spacing w:after="0" w:before="0"/>
-            </w:pPr>
-            <w:r>
-              <w:rPr>
-                <w:sz w:val="18"/>
-                <w:szCs w:val="18"/>
-              </w:rPr>
-              <w:t xml:space="preserve">kb. 351 000 fő</w:t>
-            </w:r>
-          </w:p>
-        </w:tc>
-        <w:tc>
-          <w:tcPr>
-            <w:tcW w:type="dxa" w:w="3010"/>
-            <w:tcMar>
-              <w:top w:type="dxa" w:w="60"/>
-              <w:left w:type="dxa" w:w="100"/>
-              <w:bottom w:type="dxa" w:w="60"/>
-              <w:right w:type="dxa" w:w="100"/>
-            </w:tcMar>
-          </w:tcPr>
-          <w:p>
-            <w:pPr>
-              <w:spacing w:after="0" w:before="0"/>
-            </w:pPr>
-            <w:r>
-              <w:rPr>
-                <w:sz w:val="18"/>
-                <w:szCs w:val="18"/>
-              </w:rPr>
-              <w:t xml:space="preserve">KSH, 2025/2026, előzetes</w:t>
-            </w:r>
-          </w:p>
-        </w:tc>
-      </w:tr>
-      <w:tr>
-        <w:trPr>
-          <w:tblHeader w:val="false"/>
-        </w:trPr>
-        <w:tc>
-          <w:tcPr>
-            <w:tcW w:type="dxa" w:w="3008"/>
-            <w:tcMar>
-              <w:top w:type="dxa" w:w="60"/>
-              <w:left w:type="dxa" w:w="100"/>
-              <w:bottom w:type="dxa" w:w="60"/>
-              <w:right w:type="dxa" w:w="100"/>
-            </w:tcMar>
-          </w:tcPr>
-          <w:p>
-            <w:pPr>
-              <w:spacing w:after="0" w:before="0"/>
-            </w:pPr>
-            <w:r>
-              <w:rPr>
-                <w:sz w:val="18"/>
-                <w:szCs w:val="18"/>
-              </w:rPr>
-              <w:t xml:space="preserve">felsőoktatási oktatók</w:t>
-            </w:r>
-          </w:p>
-        </w:tc>
-        <w:tc>
-          <w:tcPr>
-            <w:tcW w:type="dxa" w:w="3008"/>
-            <w:tcMar>
-              <w:top w:type="dxa" w:w="60"/>
-              <w:left w:type="dxa" w:w="100"/>
-              <w:bottom w:type="dxa" w:w="60"/>
-              <w:right w:type="dxa" w:w="100"/>
-            </w:tcMar>
-          </w:tcPr>
-          <w:p>
-            <w:pPr>
-              <w:spacing w:after="0" w:before="0"/>
-            </w:pPr>
-            <w:r>
-              <w:rPr>
-                <w:sz w:val="18"/>
-                <w:szCs w:val="18"/>
-              </w:rPr>
-              <w:t xml:space="preserve">kb. 27 000 fő</w:t>
-            </w:r>
-          </w:p>
-        </w:tc>
-        <w:tc>
-          <w:tcPr>
-            <w:tcW w:type="dxa" w:w="3010"/>
-            <w:tcMar>
-              <w:top w:type="dxa" w:w="60"/>
-              <w:left w:type="dxa" w:w="100"/>
-              <w:bottom w:type="dxa" w:w="60"/>
-              <w:right w:type="dxa" w:w="100"/>
-            </w:tcMar>
-          </w:tcPr>
-          <w:p>
-            <w:pPr>
-              <w:spacing w:after="0" w:before="0"/>
-            </w:pPr>
-            <w:r>
-              <w:rPr>
-                <w:sz w:val="18"/>
-                <w:szCs w:val="18"/>
-              </w:rPr>
-              <w:t xml:space="preserve">KSH, 2023/2024</w:t>
-            </w:r>
-          </w:p>
-        </w:tc>
-      </w:tr>
-      <w:tr>
-        <w:trPr>
-          <w:tblHeader w:val="false"/>
-        </w:trPr>
-        <w:tc>
-          <w:tcPr>
-            <w:tcW w:type="dxa" w:w="3008"/>
-            <w:tcMar>
-              <w:top w:type="dxa" w:w="60"/>
-              <w:left w:type="dxa" w:w="100"/>
-              <w:bottom w:type="dxa" w:w="60"/>
-              <w:right w:type="dxa" w:w="100"/>
-            </w:tcMar>
-          </w:tcPr>
-          <w:p>
-            <w:pPr>
-              <w:spacing w:after="0" w:before="0"/>
-            </w:pPr>
-            <w:r>
-              <w:rPr>
-                <w:sz w:val="18"/>
-                <w:szCs w:val="18"/>
-              </w:rPr>
               <w:t xml:space="preserve">szülők, gondviselők</w:t>
             </w:r>
           </w:p>
@@ -1703,218 +1000,213 @@
         <w:jc w:val="both"/>
       </w:pPr>
       <w:r>
-        <w:t xml:space="preserve">A köznevelésben és a szakképzésben főállásban foglalkoztatott pedagógusok és oktatók száma összesen közel 148 ezer fő. A 3. fejezet hatásbecslése ennél </w:t>
-      </w:r>
+        <w:t xml:space="preserve">A köznevelésben és a szakképzésben főállásban foglalkoztatott pedagógusok és oktatók száma összesen közel 148 ezer fő. A 3. fejezet hatásbecslése ennél szűkebb kört vesz alapul, az általános és középfokú iskolai pedagógusokat, összesen mintegy 117 ezer főt, mert tanulmányi rendszerhez kapcsolódó adminisztrációról az ő esetükben beszélhetünk értelmesen.</w:t>
+      </w:r>
+    </w:p>
+    <w:p>
+      <w:pPr>
+        <w:spacing w:after="140"/>
+        <w:jc w:val="both"/>
+      </w:pPr>
+      <w:r>
+        <w:t xml:space="preserve">Rajtuk kívül érintettek a köznevelési és felsőoktatási intézmények mint adatkezelők és fenntartóik, a rendszerüzemeltetők, köztük az eKRÉTA Zrt. és a tanulmányi rendszerek szállítói, valamint a hazai fejlesztők.</w:t>
+      </w:r>
+    </w:p>
+    <w:p>
+      <w:pPr>
+        <w:pStyle w:val="Heading2"/>
+        <w:spacing w:after="160" w:before="320"/>
+      </w:pPr>
+      <w:r>
+        <w:t xml:space="preserve">1.6 A szülői oldal megkerülő megoldásai</w:t>
+      </w:r>
+    </w:p>
+    <w:p>
+      <w:pPr>
+        <w:spacing w:after="140"/>
+        <w:jc w:val="both"/>
+      </w:pPr>
+      <w:r>
+        <w:t xml:space="preserve">A szülő napi valósága az, hogy sok felületet kell végigkattintania, és az iskolai a sokadik a sorban. Két gyerek esetén külön fiók, külön belépés és külön értesítési sor tartozik hozzá, az összefésülés pedig rá marad. Amit szeretne, az egyetlen kérdés a már használt eszközében: mi vár a gyerekekre a héten, melyik tantárgyból romlottak a jegyek, mikor kell igazolást beadni. Hivatalos út hiányában erre ma csak kockázatos megoldások állnak rendelkezésre.</w:t>
+      </w:r>
+    </w:p>
+    <w:p>
+      <w:pPr>
+        <w:spacing w:after="140"/>
+        <w:jc w:val="both"/>
+      </w:pPr>
+      <w:r>
+        <w:t xml:space="preserve">Erre konkrét példa az Üzenőfüzet nyílt forráskódú szolgáltatás, amelyet az előterjesztés készítője üzemeltet, és amely a szülők MI-asszisztensét köti össze a KRÉTA-val. A szolgáltatás ma kénytelen átvenni a szülőtől a KRÉTA-jelszót, a nevében belépni és a belépési tokeneket maga tárolni. A hivatalos tanulói mobilalkalmazás kliensazonosítóját és nem dokumentált végpontjait használja, ezért bármely rendszerfrissítés után működésképtelenné válhat. A hívásokat lakossági hálózaton keresztül továbbítja, mert a rendszer az adatközponti hálózatokból érkező kéréseket elutasítja. Végül saját adatkezelési tájékoztatójában kell rendeznie, hogy a lekért adatok, köztük kiskorúak adatai, a szülő által választott, akár az Unión kívüli MI-szolgáltatóhoz kerülnek.</w:t>
+      </w:r>
+    </w:p>
+    <w:p>
+      <w:pPr>
+        <w:spacing w:after="140"/>
+        <w:jc w:val="both"/>
+      </w:pPr>
+      <w:r>
+        <w:t xml:space="preserve">A szülő a kiadott hozzáférést a KRÉTA-ban nem látja, és ott nem is tudja visszavonni. Az Üzenőfüzet célja éppen az, hogy ez a közvetítő szerep ebben a formában feleslegessé váljon. Az előterjesztő érdekeltségét itt jelezzük: a javaslat elfogadása a saját szolgáltatásunk jelenlegi működési modelljét szünteti meg.</w:t>
+      </w:r>
+    </w:p>
+    <w:p>
+      <w:pPr>
+        <w:spacing w:after="140"/>
+        <w:jc w:val="both"/>
+      </w:pPr>
+      <w:r>
+        <w:t xml:space="preserve">Az utolsó pont már a felhasználás kérdése, amit ma minden szolgáltató a saját tájékoztatójában, saját belátása szerint rendez. A melléklet M4. fejezete erre ad szabályt.</w:t>
+      </w:r>
+    </w:p>
+    <w:p>
+      <w:pPr>
+        <w:pStyle w:val="Heading2"/>
+        <w:spacing w:after="160" w:before="320"/>
+      </w:pPr>
+      <w:r>
+        <w:t xml:space="preserve">1.7 A tanári oldal szabálytalan gyakorlata</w:t>
+      </w:r>
+    </w:p>
+    <w:p>
+      <w:pPr>
+        <w:spacing w:after="140"/>
+        <w:jc w:val="both"/>
+      </w:pPr>
+      <w:r>
+        <w:t xml:space="preserve">A pedagógusnál a napló, a kommunikáció, az órarend, a tananyag és az értékelés külön rendszerben van, adott esetben egy tanulásszervezési rendszerrel, e-mailekkel, megosztott dokumentumokkal és belső intézményi felületekkel együtt. Az információ átvitele egyikből a másikba kézi munka, és ez a kézi munka jelenik meg az adminisztrációs időben.</w:t>
+      </w:r>
+    </w:p>
+    <w:p>
+      <w:pPr>
+        <w:spacing w:after="140"/>
+        <w:jc w:val="both"/>
+      </w:pPr>
+      <w:r>
+        <w:t xml:space="preserve">A teher mérhető. Az OECD TALIS 2024 felmérése szerint a magyar főállású pedagógusok heti 3,2 órát fordítanak általános adminisztratív munkára, szemben a 3 órás OECD-átlaggal, és ez az érték 2018 óta nem csökkent. A stressz leggyakoribb forrásaként a megkérdezettek 55%-a a túl sok adminisztrációt jelölte meg.</w:t>
+      </w:r>
+    </w:p>
+    <w:p>
+      <w:pPr>
+        <w:spacing w:after="140"/>
+        <w:jc w:val="both"/>
+      </w:pPr>
+      <w:r>
+        <w:t xml:space="preserve">Hivatalos kapcsolódás hiányában a pedagógus egyetlen módon tud MI-t használni ehhez a munkához: a tanulói adatokat kézzel bemásolja a saját, magáncélú MI-fiókjába. Egy másolással egy vagy több osztály adatai mozognak, az iskola nevében kezelt adatokként, adatfeldolgozói szerződés nélkül. Az adatkezelő iskola ezt nem látja, korlátozni sem tudja, és semmilyen naplóban nem jelenik meg. A zártság az ellenőrzött használatot akadályozza, a kimásolást pedig nem képes megállítani; erről bővebben a 4.3 pont szól. Arról, hogy ez a gyakorlat milyen gyakori, nincs hazai mérés, és a mérhetetlenség maga is a kár egyik formája.</w:t>
+      </w:r>
+    </w:p>
+    <w:p>
+      <w:pPr>
+        <w:pBdr>
+          <w:bottom w:val="single" w:color="B0B8C4" w:sz="6"/>
+        </w:pBdr>
+        <w:spacing w:after="200" w:before="200"/>
+      </w:pPr>
+      <w:r>
+        <w:t xml:space="preserve"/>
+      </w:r>
+    </w:p>
+    <w:p>
+      <w:pPr>
+        <w:pStyle w:val="Heading1"/>
+        <w:spacing w:after="160" w:before="320"/>
+      </w:pPr>
+      <w:r>
+        <w:t xml:space="preserve">2. Előzmények</w:t>
+      </w:r>
+    </w:p>
+    <w:p>
+      <w:pPr>
+        <w:spacing w:after="140"/>
+        <w:jc w:val="both"/>
+      </w:pPr>
       <w:r>
         <w:rPr>
           <w:b/>
           <w:bCs/>
         </w:rPr>
-        <w:t xml:space="preserve">szűkebb kört</w:t>
-      </w:r>
-      <w:r>
-        <w:t xml:space="preserve"> vesz alapul: az általános és középfokú iskolai pedagógusokat, összesen mintegy 117 ezer főt, mert tanulmányi rendszerhez kapcsolódó adminisztrációról az ő esetükben beszélhetünk értelmesen.</w:t>
-      </w:r>
-    </w:p>
-    <w:p>
-      <w:pPr>
-        <w:spacing w:after="140"/>
-        <w:jc w:val="both"/>
-      </w:pPr>
-      <w:r>
-        <w:t xml:space="preserve">Rajtuk kívül érintettek a köznevelési és felsőoktatási intézmények mint adatkezelők és fenntartóik, a rendszerüzemeltetők (az eKRÉTA Zrt. és a tanulmányi rendszerek szállítói, köztük az SDA Informatika Zrt.), valamint a hazai fejlesztők.</w:t>
-      </w:r>
-    </w:p>
-    <w:p>
-      <w:pPr>
-        <w:pStyle w:val="Heading2"/>
-        <w:spacing w:after="160" w:before="320"/>
-      </w:pPr>
-      <w:r>
-        <w:t xml:space="preserve">1.6 A szülői oldalon a széttöredezettség megkerülő megoldásokat szül</w:t>
-      </w:r>
-    </w:p>
-    <w:p>
-      <w:pPr>
-        <w:spacing w:after="140"/>
-        <w:jc w:val="both"/>
-      </w:pPr>
-      <w:r>
-        <w:t xml:space="preserve">A szülő napi valósága nem az, hogy hiányzik neki egy MI-asszisztens. Az, hogy túl sok felületet kell végigkattintania, és az iskolai a sokadik a sorban. Két gyerek esetén nem is egy: külön fiók, külön belépés, külön értesítési sor — az összefésülés pedig a szülő fejében történik.</w:t>
-      </w:r>
-    </w:p>
-    <w:p>
-      <w:pPr>
-        <w:spacing w:after="140"/>
-        <w:jc w:val="both"/>
-      </w:pPr>
-      <w:r>
-        <w:t xml:space="preserve">Amit szeretne, az egyetlen kérdés a már használt eszközében: mi vár a gyerekekre a héten, melyik tantárgyból romlottak a jegyek, mikor kell igazolást beadni. Hivatalos út nélkül erre csak kockázatos módok vannak.</w:t>
-      </w:r>
-    </w:p>
-    <w:p>
-      <w:pPr>
-        <w:spacing w:after="140"/>
-        <w:jc w:val="both"/>
-      </w:pPr>
-      <w:r>
-        <w:t xml:space="preserve">Konkrét példa az </w:t>
-      </w:r>
+        <w:t xml:space="preserve">2011.</w:t>
+      </w:r>
+      <w:r>
+        <w:t xml:space="preserve"> Az Nkt. és az Nftv. rendezi a köznevelési és felsőoktatási adatkezelést. Egyik sem tartalmaz rendelkezést arról, hogy az érintett a saját adatához gépi úton, általa választott szoftverrel hozzáférhessen.</w:t>
+      </w:r>
+    </w:p>
+    <w:p>
+      <w:pPr>
+        <w:spacing w:after="140"/>
+        <w:jc w:val="both"/>
+      </w:pPr>
       <w:r>
         <w:rPr>
           <w:b/>
           <w:bCs/>
         </w:rPr>
-        <w:t xml:space="preserve">Üzenőfüzet</w:t>
-      </w:r>
-      <w:r>
-        <w:t xml:space="preserve"> nyílt forráskódú szolgáltatás, amelyet az előterjesztés készítője üzemeltet, és amely a szülők MI-asszisztensét köti össze a KRÉTA-val. Ehhez ma kénytelen:</w:t>
-      </w:r>
-    </w:p>
-    <w:p>
-      <w:pPr>
-        <w:pStyle w:val="ListParagraph"/>
-        <w:numPr>
-          <w:ilvl w:val="0"/>
-          <w:numId w:val="1"/>
-        </w:numPr>
-        <w:spacing w:after="60"/>
-      </w:pPr>
-      <w:r>
-        <w:t xml:space="preserve">a szülőtől átvenni a KRÉTA-jelszót, a nevében belépni, és a belépési tokeneket maga tárolni;</w:t>
-      </w:r>
-    </w:p>
-    <w:p>
-      <w:pPr>
-        <w:pStyle w:val="ListParagraph"/>
-        <w:numPr>
-          <w:ilvl w:val="0"/>
-          <w:numId w:val="1"/>
-        </w:numPr>
-        <w:spacing w:after="60"/>
-      </w:pPr>
-      <w:r>
-        <w:t xml:space="preserve">a hivatalos tanulói mobilalkalmazás kliensazonosítóját és nem dokumentált végpontjait használni, így bármely rendszerfrissítés után működésképtelenné válhat;</w:t>
-      </w:r>
-    </w:p>
-    <w:p>
-      <w:pPr>
-        <w:pStyle w:val="ListParagraph"/>
-        <w:numPr>
-          <w:ilvl w:val="0"/>
-          <w:numId w:val="1"/>
-        </w:numPr>
-        <w:spacing w:after="60"/>
-      </w:pPr>
-      <w:r>
-        <w:t xml:space="preserve">a hívásokat lakossági hálózaton továbbítani, mert a rendszer az adatközponti hálózatokból érkező kéréseket elutasítja;</w:t>
-      </w:r>
-    </w:p>
-    <w:p>
-      <w:pPr>
-        <w:pStyle w:val="ListParagraph"/>
-        <w:numPr>
-          <w:ilvl w:val="0"/>
-          <w:numId w:val="1"/>
-        </w:numPr>
-        <w:spacing w:after="60"/>
-      </w:pPr>
-      <w:r>
-        <w:t xml:space="preserve">saját tájékoztatóban kezelni, hogy a lekért adatok — köztük kiskorúak adatai — a szülő által választott, akár az Unión kívüli MI-szolgáltatóhoz kerülnek.</w:t>
-      </w:r>
-    </w:p>
-    <w:p>
-      <w:pPr>
-        <w:spacing w:after="140"/>
-        <w:jc w:val="both"/>
-      </w:pPr>
-      <w:r>
-        <w:t xml:space="preserve">A szülő a kiadott hozzáférést a KRÉTA-ban nem látja és ott nem tudja visszavonni. </w:t>
-      </w:r>
+        <w:t xml:space="preserve">2012–2015.</w:t>
+      </w:r>
+      <w:r>
+        <w:t xml:space="preserve"> Megjelenik az OAuth 2.0 engedélyezési keretrendszer (RFC 6749, 2012), majd a nyilvános kliensek védelmét szolgáló PKCE (RFC 7636, 2015), a dinamikus kliensregisztráció (RFC 7591, 2015) és a tokenvisszavonás (RFC 7009, 2013). A jelszóátadás nélküli, visszavonható, harmadik fél általi hozzáférés ettől kezdve iparági alapmegoldás.</w:t>
+      </w:r>
+    </w:p>
+    <w:p>
+      <w:pPr>
+        <w:spacing w:after="140"/>
+        <w:jc w:val="both"/>
+      </w:pPr>
       <w:r>
         <w:rPr>
           <w:b/>
           <w:bCs/>
         </w:rPr>
-        <w:t xml:space="preserve">Az Üzenőfüzet célja, hogy ez a közvetítő szerep ebben a formában feleslegessé váljon.</w:t>
-      </w:r>
-      <w:r>
-        <w:t xml:space="preserve"> Az előterjesztő érdekeltségét itt jelezzük: a javaslat elfogadása a saját szolgáltatásunk jelenlegi működési modelljét szünteti meg.</w:t>
-      </w:r>
-    </w:p>
-    <w:p>
-      <w:pPr>
-        <w:spacing w:after="140"/>
-        <w:jc w:val="both"/>
-      </w:pPr>
-      <w:r>
-        <w:t xml:space="preserve">Figyeljük meg, hogy az utolsó pont már nem hozzáférési, hanem </w:t>
-      </w:r>
+        <w:t xml:space="preserve">2015–2019.</w:t>
+      </w:r>
+      <w:r>
+        <w:t xml:space="preserve"> A pénzügyi szektor ugyanezt a problémát oldja meg. A PSD2 és az (EU) 2018/389 rendelet dedikált, biztonságos felületet követel meg, nyilvános specifikációval és tesztkörnyezettel, a harmadik fél szolgáltatók pedig engedélyezett szereplők. A párhuzam mindkét élét a melléklet M2.6 pontja vezeti végig.</w:t>
+      </w:r>
+    </w:p>
+    <w:p>
+      <w:pPr>
+        <w:spacing w:after="140"/>
+        <w:jc w:val="both"/>
+      </w:pPr>
       <w:r>
         <w:rPr>
           <w:b/>
           <w:bCs/>
         </w:rPr>
-        <w:t xml:space="preserve">felhasználási</w:t>
-      </w:r>
-      <w:r>
-        <w:t xml:space="preserve"> kérdés. Ma ezt minden szolgáltató a saját tájékoztatójában, saját belátása szerint kezeli. A melléklet M4. fejezete erre ad szabályt.</w:t>
-      </w:r>
-    </w:p>
-    <w:p>
-      <w:pPr>
-        <w:pStyle w:val="Heading2"/>
-        <w:spacing w:after="160" w:before="320"/>
-      </w:pPr>
-      <w:r>
-        <w:t xml:space="preserve">1.7 A tanári oldalon a széttöredezettség szabálytalan használatot szül</w:t>
-      </w:r>
-    </w:p>
-    <w:p>
-      <w:pPr>
-        <w:spacing w:after="140"/>
-        <w:jc w:val="both"/>
-      </w:pPr>
-      <w:r>
-        <w:t xml:space="preserve">A pedagógus ugyanezt éli meg, más szerepben. A napló, a kommunikáció, az órarend, a tananyag, az értékelés, adott esetben egy tanulásszervezési rendszer, emellett e-mail, megosztott dokumentumok és belső intézményi felületek — mind külön. Az információ átvitele egyikből a másikba kézi munka, és éppen ez a kézi munka jelenik meg az adminisztrációs időben.</w:t>
-      </w:r>
-    </w:p>
-    <w:p>
-      <w:pPr>
-        <w:spacing w:after="140"/>
-        <w:jc w:val="both"/>
-      </w:pPr>
-      <w:r>
-        <w:t xml:space="preserve">A teher mérhető: az OECD TALIS 2024 felmérése szerint a magyar főállású pedagógusok heti </w:t>
-      </w:r>
+        <w:t xml:space="preserve">2016–2018.</w:t>
+      </w:r>
+      <w:r>
+        <w:t xml:space="preserve"> A GDPR 2018. május 25-től alkalmazandó. Bevezeti az adathordozhatóságot a 20. cikkben, de a közérdekű feladat keretében végzett adatkezelést kiveszi a hatálya alól.</w:t>
+      </w:r>
+    </w:p>
+    <w:p>
+      <w:pPr>
+        <w:spacing w:after="140"/>
+        <w:jc w:val="both"/>
+      </w:pPr>
       <w:r>
         <w:rPr>
           <w:b/>
           <w:bCs/>
         </w:rPr>
-        <w:t xml:space="preserve">3,2 órát</w:t>
-      </w:r>
-      <w:r>
-        <w:t xml:space="preserve"> fordítanak általános adminisztratív munkára (OECD-átlag: 3 óra), és ez az érték 2018 óta nem csökkent. A stressz leggyakoribb forrásaként a megkérdezettek </w:t>
-      </w:r>
+        <w:t xml:space="preserve">2019 körül.</w:t>
+      </w:r>
+      <w:r>
+        <w:t xml:space="preserve"> Megjelennek a KRÉTA hivatalos mobilalkalmazásai, és a KRÉTA-adatok mobil elérése kizárólag ezeken keresztül válik lehetségessé. [ELLENŐRIZENDŐ: az egyes alkalmazások megjelenési éve]</w:t>
+      </w:r>
+    </w:p>
+    <w:p>
+      <w:pPr>
+        <w:spacing w:after="140"/>
+        <w:jc w:val="both"/>
+      </w:pPr>
       <w:r>
         <w:rPr>
           <w:b/>
           <w:bCs/>
         </w:rPr>
-        <w:t xml:space="preserve">55%-a</w:t>
-      </w:r>
-      <w:r>
-        <w:t xml:space="preserve"> a túl sok adminisztrációt jelölte meg.</w:t>
-      </w:r>
-    </w:p>
-    <w:p>
-      <w:pPr>
-        <w:spacing w:after="140"/>
-        <w:jc w:val="both"/>
-      </w:pPr>
-      <w:r>
-        <w:t xml:space="preserve">Hivatalos kapcsolódás hiányában a pedagógus egyetlen módon tud MI-t használni ehhez a munkához: a tanulói adatokat kézzel bemásolja a saját, magáncélú MI-fiókjába. Egy másolással egy vagy több osztály adatai mozognak, az iskola nevében kezelt adatokként, adatfeldolgozói szerződés nélkül. Az adatkezelő iskola ezt nem látja, nem tudja korlátozni, és semmilyen naplóban nem jelenik meg.</w:t>
+        <w:t xml:space="preserve">2023.</w:t>
+      </w:r>
+      <w:r>
+        <w:t xml:space="preserve"> Október 19-én megszűnik a Neptun hivatalos mobilalkalmazása. Ugyanebben az évben születik az adatrendelet, amely a melléklet M2.4 pontjában írt korlátokkal a felhasználói adathozzáférés irányát jelzi.</w:t>
       </w:r>
     </w:p>
     <w:p>
@@ -1927,10 +1219,35 @@
           <w:b/>
           <w:bCs/>
         </w:rPr>
-        <w:t xml:space="preserve">A zártság tehát nem az ellenőrizetlen használatot akadályozza, hanem az ellenőrzöttet</w:t>
-      </w:r>
-      <w:r>
-        <w:t xml:space="preserve"> (bővebben 4.3). Arról viszont, hogy ez a gyakorlat milyen gyakori, nincs hazai mérés — és éppen ez a kár egyik formája: a jelenség szerkezeti okból mérhetetlen.</w:t>
+        <w:t xml:space="preserve">2024–2025.</w:t>
+      </w:r>
+      <w:r>
+        <w:t xml:space="preserve"> 2024 novemberében megjelenik a Model Context Protocol, amely OAuth-alapú delegált hozzáférésre építve ad szabványos módot MI-asszisztensek külső rendszerekhez kapcsolására. 2025 januárjában megjelenik az RFC 9700 (BCP 240), az OAuth 2.0 biztonsági legjobb gyakorlata, amely kötelezővé teszi a PKCE-t, elavulttá nyilvánítja az implicit és a jelszó alapú folyamatot, és kezeli az összekeverési támadásokat.</w:t>
+      </w:r>
+    </w:p>
+    <w:p>
+      <w:pPr>
+        <w:spacing w:after="140"/>
+        <w:jc w:val="both"/>
+      </w:pPr>
+      <w:r>
+        <w:rPr>
+          <w:b/>
+          <w:bCs/>
+        </w:rPr>
+        <w:t xml:space="preserve">2025.</w:t>
+      </w:r>
+      <w:r>
+        <w:t xml:space="preserve"> Hatályba lép az (EU) 2025/327 rendelet az európai egészségügyi adattérről. Ágazati jogszabály hoz létre elektronikus hozzáférési jogot közfeladaton alapuló, különösen érzékeny nyilvántartásban; a párhuzamot a melléklet M2.3 pontja fejti ki.</w:t>
+      </w:r>
+    </w:p>
+    <w:p>
+      <w:pPr>
+        <w:spacing w:after="140"/>
+        <w:jc w:val="both"/>
+      </w:pPr>
+      <w:r>
+        <w:t xml:space="preserve">Az oktatási rendszerek felülete mindeközben változatlan maradt.</w:t>
       </w:r>
     </w:p>
     <w:p>
@@ -1950,173 +1267,6 @@
         <w:spacing w:after="160" w:before="320"/>
       </w:pPr>
       <w:r>
-        <w:t xml:space="preserve">2. Előzmények</w:t>
-      </w:r>
-    </w:p>
-    <w:p>
-      <w:pPr>
-        <w:spacing w:after="140"/>
-        <w:jc w:val="both"/>
-      </w:pPr>
-      <w:r>
-        <w:rPr>
-          <w:b/>
-          <w:bCs/>
-        </w:rPr>
-        <w:t xml:space="preserve">2011 — az oktatási nyilvántartások jogi kerete.</w:t>
-      </w:r>
-      <w:r>
-        <w:t xml:space="preserve"> Az Nkt. és az Nftv. rendezi a köznevelési és felsőoktatási adatkezelést. Egyik sem tartalmaz rendelkezést arról, hogy az érintett a saját adatához gépi úton, általa választott szoftverrel hozzáférhessen.</w:t>
-      </w:r>
-    </w:p>
-    <w:p>
-      <w:pPr>
-        <w:spacing w:after="140"/>
-        <w:jc w:val="both"/>
-      </w:pPr>
-      <w:r>
-        <w:rPr>
-          <w:b/>
-          <w:bCs/>
-        </w:rPr>
-        <w:t xml:space="preserve">2012–2015 — a delegált hozzáférés szabványai.</w:t>
-      </w:r>
-      <w:r>
-        <w:t xml:space="preserve"> Megjelenik az OAuth 2.0 engedélyezési keretrendszer (RFC 6749, 2012), majd a nyilvános kliensek védelmét szolgáló PKCE (RFC 7636, 2015), a dinamikus kliensregisztráció (RFC 7591, 2015) és a tokenvisszavonás (RFC 7009, 2013). A jelszóátadás nélküli, visszavonható, harmadik fél általi hozzáférés ettől kezdve iparági alapmegoldás.</w:t>
-      </w:r>
-    </w:p>
-    <w:p>
-      <w:pPr>
-        <w:spacing w:after="140"/>
-        <w:jc w:val="both"/>
-      </w:pPr>
-      <w:r>
-        <w:rPr>
-          <w:b/>
-          <w:bCs/>
-        </w:rPr>
-        <w:t xml:space="preserve">2015–2019 — a pénzügyi szektor megoldja ugyanezt a problémát.</w:t>
-      </w:r>
-      <w:r>
-        <w:t xml:space="preserve"> A PSD2 és az (EU) 2018/389 rendelet dedikált, biztonságos felületet követel meg, nyilvános specifikációval és tesztkörnyezettel; a harmadik fél szolgáltatók engedélyezett szereplők (lásd a melléklet M2.6 pontját).</w:t>
-      </w:r>
-    </w:p>
-    <w:p>
-      <w:pPr>
-        <w:spacing w:after="140"/>
-        <w:jc w:val="both"/>
-      </w:pPr>
-      <w:r>
-        <w:rPr>
-          <w:b/>
-          <w:bCs/>
-        </w:rPr>
-        <w:t xml:space="preserve">2016–2018 — a GDPR.</w:t>
-      </w:r>
-      <w:r>
-        <w:t xml:space="preserve"> Alkalmazandó 2018. május 25-től. Bevezeti az adathordozhatóságot (20. cikk), de a közérdekű feladat keretében végzett adatkezelést kiveszi alóla.</w:t>
-      </w:r>
-    </w:p>
-    <w:p>
-      <w:pPr>
-        <w:spacing w:after="140"/>
-        <w:jc w:val="both"/>
-      </w:pPr>
-      <w:r>
-        <w:rPr>
-          <w:b/>
-          <w:bCs/>
-        </w:rPr>
-        <w:t xml:space="preserve">2019 körül — megjelennek a KRÉTA hivatalos mobilalkalmazásai.</w:t>
-      </w:r>
-      <w:r>
-        <w:t xml:space="preserve"> A KRÉTA-adatok mobil elérése kizárólag a saját kliensein keresztül lehetséges. [ELLENŐRIZENDŐ: az egyes alkalmazások megjelenési éve]</w:t>
-      </w:r>
-    </w:p>
-    <w:p>
-      <w:pPr>
-        <w:spacing w:after="140"/>
-        <w:jc w:val="both"/>
-      </w:pPr>
-      <w:r>
-        <w:rPr>
-          <w:b/>
-          <w:bCs/>
-        </w:rPr>
-        <w:t xml:space="preserve">2023 — a Neptun-app megszűnése.</w:t>
-      </w:r>
-      <w:r>
-        <w:t xml:space="preserve"> 2023. október 19-én megszűnik a Neptun hivatalos mobilalkalmazása. Ugyanebben az évben születik az adatrendelet, amely — a melléklet M2.4 pontjában írt korlátokkal — a felhasználói adathozzáférés irányát jelzi.</w:t>
-      </w:r>
-    </w:p>
-    <w:p>
-      <w:pPr>
-        <w:spacing w:after="140"/>
-        <w:jc w:val="both"/>
-      </w:pPr>
-      <w:r>
-        <w:rPr>
-          <w:b/>
-          <w:bCs/>
-        </w:rPr>
-        <w:t xml:space="preserve">2024–2025 — a szabványos csatlakozás és a biztonsági alapvetés.</w:t>
-      </w:r>
-      <w:r>
-        <w:t xml:space="preserve"> 2024 novemberében megjelenik a Model Context Protocol, amely OAuth-alapú delegált hozzáférésre építve ad szabványos módot MI-asszisztensek külső rendszerekhez kapcsolására. 2025 januárjában megjelenik az </w:t>
-      </w:r>
-      <w:r>
-        <w:rPr>
-          <w:b/>
-          <w:bCs/>
-        </w:rPr>
-        <w:t xml:space="preserve">RFC 9700</w:t>
-      </w:r>
-      <w:r>
-        <w:t xml:space="preserve"> (BCP 240), az OAuth 2.0 biztonsági legjobb gyakorlata, amely kötelezővé teszi a PKCE-t, elavulttá nyilvánítja az implicit és a jelszó alapú folyamatot, és kezeli az összekeverési (mix-up) támadásokat.</w:t>
-      </w:r>
-    </w:p>
-    <w:p>
-      <w:pPr>
-        <w:spacing w:after="140"/>
-        <w:jc w:val="both"/>
-      </w:pPr>
-      <w:r>
-        <w:rPr>
-          <w:b/>
-          <w:bCs/>
-        </w:rPr>
-        <w:t xml:space="preserve">2025 — az európai egészségügyi adattér.</w:t>
-      </w:r>
-      <w:r>
-        <w:t xml:space="preserve"> Az (EU) 2025/327 rendelet hatályba lép: ágazati jogszabály hoz létre elektronikus hozzáférési jogot közfeladaton alapuló, különösen érzékeny nyilvántartásban (lásd 3.3).</w:t>
-      </w:r>
-    </w:p>
-    <w:p>
-      <w:pPr>
-        <w:spacing w:after="140"/>
-        <w:jc w:val="both"/>
-      </w:pPr>
-      <w:r>
-        <w:t xml:space="preserve">Az oktatási rendszerek felülete mindeközben változatlan maradt.</w:t>
-      </w:r>
-    </w:p>
-    <w:p>
-      <w:pPr>
-        <w:pBdr>
-          <w:bottom w:val="single" w:color="B0B8C4" w:sz="6"/>
-        </w:pBdr>
-        <w:spacing w:after="200" w:before="200"/>
-      </w:pPr>
-      <w:r>
-        <w:t xml:space="preserve"/>
-      </w:r>
-    </w:p>
-    <w:p>
-      <w:pPr>
-        <w:pStyle w:val="Heading1"/>
-        <w:spacing w:after="160" w:before="320"/>
-      </w:pPr>
-      <w:r>
         <w:t xml:space="preserve">3. Okozott kár</w:t>
       </w:r>
     </w:p>
@@ -2126,37 +1276,7 @@
         <w:jc w:val="both"/>
       </w:pPr>
       <w:r>
-        <w:t xml:space="preserve">Ebben a fejezetben külön jelöljük, mi </w:t>
-      </w:r>
-      <w:r>
-        <w:rPr>
-          <w:b/>
-          <w:bCs/>
-        </w:rPr>
-        <w:t xml:space="preserve">dokumentált tény</w:t>
-      </w:r>
-      <w:r>
-        <w:t xml:space="preserve">, mi </w:t>
-      </w:r>
-      <w:r>
-        <w:rPr>
-          <w:b/>
-          <w:bCs/>
-        </w:rPr>
-        <w:t xml:space="preserve">példaszámítás</w:t>
-      </w:r>
-      <w:r>
-        <w:t xml:space="preserve">, és mi </w:t>
-      </w:r>
-      <w:r>
-        <w:rPr>
-          <w:b/>
-          <w:bCs/>
-        </w:rPr>
-        <w:t xml:space="preserve">feltételezés</w:t>
-      </w:r>
-      <w:r>
-        <w:t xml:space="preserve">.</w:t>
+        <w:t xml:space="preserve">A fejezet megkülönbözteti a dokumentált tényeket a példaszámításoktól és a feltételezésektől, és ezt az alfejezetek címe is jelzi.</w:t>
       </w:r>
     </w:p>
     <w:p>
@@ -2165,78 +1285,25 @@
         <w:spacing w:after="160" w:before="320"/>
       </w:pPr>
       <w:r>
-        <w:t xml:space="preserve">3.1 Elvesztegetett pedagógusi kapacitás — példaszámítás, nem előrejelzés</w:t>
-      </w:r>
-    </w:p>
-    <w:p>
-      <w:pPr>
-        <w:spacing w:after="140"/>
-        <w:jc w:val="both"/>
-      </w:pPr>
-      <w:r>
-        <w:rPr>
-          <w:b/>
-          <w:bCs/>
-        </w:rPr>
-        <w:t xml:space="preserve">A kiindulás.</w:t>
-      </w:r>
-      <w:r>
-        <w:t xml:space="preserve"> Az általános és középfokú iskolai pedagógusok száma mintegy </w:t>
-      </w:r>
-      <w:r>
-        <w:rPr>
-          <w:b/>
-          <w:bCs/>
-        </w:rPr>
-        <w:t xml:space="preserve">117 ezer fő</w:t>
-      </w:r>
-      <w:r>
-        <w:t xml:space="preserve"> (74 ezer általános iskolai és 43 ezer középfokú, KSH 2024/2025, előzetes). Ez szűkebb kör, mint a köznevelés és a szakképzés együttes 148 ezres létszáma: az óvodapedagógusokat és a tanulmányi rendszerhez nem kapcsolódó feladatköröket kihagytuk, mert rájuk a javaslat nem értelmezhető.</w:t>
-      </w:r>
-    </w:p>
-    <w:p>
-      <w:pPr>
-        <w:spacing w:after="140"/>
-        <w:jc w:val="both"/>
-      </w:pPr>
-      <w:r>
-        <w:t xml:space="preserve">Heti 3,2 óra általános adminisztráció és 36 tanítási hét mellett ez évente </w:t>
-      </w:r>
-      <w:r>
-        <w:rPr>
-          <w:b/>
-          <w:bCs/>
-        </w:rPr>
-        <w:t xml:space="preserve">mintegy 13,5 millió pedagógusi munkaóra</w:t>
-      </w:r>
-      <w:r>
-        <w:t xml:space="preserve">.</w:t>
-      </w:r>
-    </w:p>
-    <w:p>
-      <w:pPr>
-        <w:spacing w:after="140"/>
-        <w:jc w:val="both"/>
-      </w:pPr>
-      <w:r>
-        <w:rPr>
-          <w:b/>
-          <w:bCs/>
-        </w:rPr>
-        <w:t xml:space="preserve">Miért nem elég egyetlen százalék.</w:t>
-      </w:r>
-      <w:r>
-        <w:t xml:space="preserve"> A TALIS „általános adminisztratív munka” kategóriája nem azonos azzal, amit egy tanulmányi rendszerhez kapcsolt MI érinteni tud: sok adminisztráció papíralapú, szervezési, vagy nem a naplóhoz kötődik. Ezért </w:t>
-      </w:r>
-      <w:r>
-        <w:rPr>
-          <w:b/>
-          <w:bCs/>
-        </w:rPr>
-        <w:t xml:space="preserve">két külön paraméterrel</w:t>
-      </w:r>
-      <w:r>
-        <w:t xml:space="preserve"> számolunk:</w:t>
+        <w:t xml:space="preserve">3.1 Elvesztegetett pedagógusi kapacitás, példaszámítás</w:t>
+      </w:r>
+    </w:p>
+    <w:p>
+      <w:pPr>
+        <w:spacing w:after="140"/>
+        <w:jc w:val="both"/>
+      </w:pPr>
+      <w:r>
+        <w:t xml:space="preserve">Az általános és középfokú iskolai pedagógusok száma mintegy 117 ezer fő, ebből 74 ezer általános iskolai és 43 ezer középfokú (KSH 2024/2025, előzetes). Ez szűkebb kör a köznevelés és a szakképzés együttes 148 ezres létszámánál, mert az óvodapedagógusokat és a tanulmányi rendszerhez nem kapcsolódó feladatköröket kihagytuk. Heti 3,2 óra általános adminisztráció és 36 tanítási hét mellett ez évente mintegy 13,5 millió pedagógusi munkaóra.</w:t>
+      </w:r>
+    </w:p>
+    <w:p>
+      <w:pPr>
+        <w:spacing w:after="140"/>
+        <w:jc w:val="both"/>
+      </w:pPr>
+      <w:r>
+        <w:t xml:space="preserve">Egyetlen százalékos érték ebből nem vezethető le megbízhatóan. A TALIS „általános adminisztratív munka" kategóriája tágabb annál, amit egy tanulmányi rendszerhez kapcsolt MI érinteni tud, hiszen sok adminisztráció papíralapú, szervezési jellegű, vagy nem a naplóhoz kötődik. Ezért két külön paraméterrel számolunk:</w:t>
       </w:r>
     </w:p>
     <w:p>
@@ -2248,53 +1315,16 @@
         <w:ind w:left="360"/>
       </w:pPr>
       <w:r>
-        <w:t xml:space="preserve">eredő megtakarítás = </w:t>
-      </w:r>
-      <w:r>
-        <w:rPr>
-          <w:b/>
-          <w:bCs/>
-        </w:rPr>
-        <w:t xml:space="preserve">érinthető arány</w:t>
-      </w:r>
-      <w:r>
-        <w:t xml:space="preserve"> × </w:t>
-      </w:r>
-      <w:r>
-        <w:rPr>
-          <w:b/>
-          <w:bCs/>
-        </w:rPr>
-        <w:t xml:space="preserve">időnyereség az érintett részen</w:t>
-      </w:r>
-    </w:p>
-    <w:p>
-      <w:pPr>
-        <w:spacing w:after="140"/>
-        <w:jc w:val="both"/>
-      </w:pPr>
-      <w:r>
-        <w:t xml:space="preserve">Az </w:t>
-      </w:r>
-      <w:r>
-        <w:rPr>
-          <w:b/>
-          <w:bCs/>
-        </w:rPr>
-        <w:t xml:space="preserve">érinthető arány</w:t>
-      </w:r>
-      <w:r>
-        <w:t xml:space="preserve"> az adminisztrációnak azt a részét jelöli, amely egyáltalán kötődik tanulmányi rendszerből származó adathoz; az </w:t>
-      </w:r>
-      <w:r>
-        <w:rPr>
-          <w:b/>
-          <w:bCs/>
-        </w:rPr>
-        <w:t xml:space="preserve">időnyereség</w:t>
-      </w:r>
-      <w:r>
-        <w:t xml:space="preserve"> azt, hogy ezen belül mennyit rövidít az integrált MI — beleszámítva az utólagos ellenőrzés idejét is.</w:t>
+        <w:t xml:space="preserve">eredő megtakarítás = érinthető arány × időnyereség az érintett részen</w:t>
+      </w:r>
+    </w:p>
+    <w:p>
+      <w:pPr>
+        <w:spacing w:after="140"/>
+        <w:jc w:val="both"/>
+      </w:pPr>
+      <w:r>
+        <w:t xml:space="preserve">Az érinthető arány az adminisztrációnak azt a részét jelöli, amely egyáltalán kötődik tanulmányi rendszerből származó adathoz. Az időnyereség azt mutatja, ezen belül mennyit rövidít az integrált MI, beleszámítva az utólagos ellenőrzés idejét is.</w:t>
       </w:r>
     </w:p>
     <w:tbl>
@@ -2738,95 +1768,25 @@
         <w:jc w:val="both"/>
       </w:pPr>
       <w:r>
-        <w:rPr>
-          <w:b/>
-          <w:bCs/>
-        </w:rPr>
-        <w:t xml:space="preserve">A kiemelt cella példaszámítás.</w:t>
-      </w:r>
-      <w:r>
-        <w:t xml:space="preserve"> Ha az adminisztráció 35%-a érinthető, és azon belül 40% időnyereség érhető el, az eredő 14%: évente </w:t>
-      </w:r>
-      <w:r>
-        <w:rPr>
-          <w:b/>
-          <w:bCs/>
-        </w:rPr>
-        <w:t xml:space="preserve">mintegy 1,9 millió pedagógusi munkaóra</w:t>
-      </w:r>
-      <w:r>
-        <w:t xml:space="preserve">, pedagógusonként </w:t>
-      </w:r>
-      <w:r>
-        <w:rPr>
-          <w:b/>
-          <w:bCs/>
-        </w:rPr>
-        <w:t xml:space="preserve">körülbelül 16 óra</w:t>
-      </w:r>
-      <w:r>
-        <w:t xml:space="preserve">.</w:t>
-      </w:r>
-    </w:p>
-    <w:p>
-      <w:pPr>
-        <w:spacing w:after="140"/>
-        <w:jc w:val="both"/>
-      </w:pPr>
-      <w:r>
-        <w:t xml:space="preserve">Ez </w:t>
-      </w:r>
-      <w:r>
-        <w:rPr>
-          <w:b/>
-          <w:bCs/>
-        </w:rPr>
-        <w:t xml:space="preserve">nem előrejelzés és nem vállalás</w:t>
-      </w:r>
-      <w:r>
-        <w:t xml:space="preserve">. Egyik paraméterre sincs hazai mérés; a két szám azt mutatja meg, milyen nagyságrendről beszélünk, és hogy a végeredmény melyik feltevésre érzékeny. A valódi értéket a 3.2 pont szerinti pilotnak kell megadnia.</w:t>
-      </w:r>
-    </w:p>
-    <w:p>
-      <w:pPr>
-        <w:spacing w:after="140"/>
-        <w:jc w:val="both"/>
-      </w:pPr>
-      <w:r>
-        <w:rPr>
-          <w:b/>
-          <w:bCs/>
-        </w:rPr>
-        <w:t xml:space="preserve">Miért nem forintosítunk.</w:t>
-      </w:r>
-      <w:r>
-        <w:t xml:space="preserve"> A felszabaduló időt szándékosan nem fejezzük ki bérértéken. A pedagógusok létszáma nem csökken, a bérük nem lesz kevesebb, tehát </w:t>
-      </w:r>
-      <w:r>
-        <w:rPr>
-          <w:b/>
-          <w:bCs/>
-        </w:rPr>
-        <w:t xml:space="preserve">költségvetési megtakarítás nem keletkezik</w:t>
-      </w:r>
-      <w:r>
-        <w:t xml:space="preserve">; ami keletkezik, az felszabaduló szakmai kapacitás. Az „évi 1,9 millió óra” és a „pedagógusonként évi 16 óra” védhetőbb állítás bármely forintösszegnél, és nem téveszti meg azt sem, aki a költségvetési oldalt olvassa.</w:t>
-      </w:r>
-    </w:p>
-    <w:p>
-      <w:pPr>
-        <w:spacing w:after="140"/>
-        <w:jc w:val="both"/>
-      </w:pPr>
-      <w:r>
-        <w:rPr>
-          <w:b/>
-          <w:bCs/>
-        </w:rPr>
-        <w:t xml:space="preserve">A költségoldal</w:t>
-      </w:r>
-      <w:r>
-        <w:t xml:space="preserve"> — az üzemeltetői ráfordítás, a nyilvántartás működtetése, az intézményi felkészítés — még nem készült el. Ezt a 8. fejezet nyitott kérdésként rögzíti.</w:t>
+        <w:t xml:space="preserve">A kiemelt cella példaszámítás. Ha az adminisztráció 35%-a érinthető, és azon belül 40% időnyereség érhető el, az eredő 14%: évente mintegy 1,9 millió pedagógusi munkaóra, pedagógusonként körülbelül 16 óra. Egyik paraméterre sincs hazai mérés, ezért a táblázat inkább a nagyságrendet mutatja meg, és azt, melyik feltevésre érzékeny a végeredmény. A valódi értéket a 3.2 pont szerinti pilotnak kell megadnia.</w:t>
+      </w:r>
+    </w:p>
+    <w:p>
+      <w:pPr>
+        <w:spacing w:after="140"/>
+        <w:jc w:val="both"/>
+      </w:pPr>
+      <w:r>
+        <w:t xml:space="preserve">A felszabaduló időt szándékosan nem fejezzük ki bérértéken. A pedagógusok létszáma nem csökken és a bérük sem lesz kevesebb, tehát költségvetési megtakarítás nem keletkezik; ami keletkezik, az felszabaduló szakmai kapacitás. Az évi 1,9 millió óra és a pedagógusonkénti évi 16 óra olyan állítás, amely a költségvetési oldalt olvasó számára sem félrevezető.</w:t>
+      </w:r>
+    </w:p>
+    <w:p>
+      <w:pPr>
+        <w:spacing w:after="140"/>
+        <w:jc w:val="both"/>
+      </w:pPr>
+      <w:r>
+        <w:t xml:space="preserve">A számítás költségoldala, vagyis az üzemeltetői ráfordítás, a nyilvántartás működtetése és az intézményi felkészítés, még nem készült el. Ezt a 8. fejezet nyitott kérdésként rögzíti.</w:t>
       </w:r>
     </w:p>
     <w:p>
@@ -2835,153 +1795,34 @@
         <w:spacing w:after="160" w:before="320"/>
       </w:pPr>
       <w:r>
-        <w:t xml:space="preserve">3.2 Amit mérni kell: pilot a hatásvizsgálat helyett</w:t>
-      </w:r>
-    </w:p>
-    <w:p>
-      <w:pPr>
-        <w:spacing w:after="140"/>
-        <w:jc w:val="both"/>
-      </w:pPr>
-      <w:r>
-        <w:t xml:space="preserve">A fenti számítás legnagyobb gyengesége, hogy magyar mérés nélkül készült. Ezt nem magyarázni kell, hanem orvosolni. </w:t>
-      </w:r>
-      <w:r>
-        <w:rPr>
-          <w:b/>
-          <w:bCs/>
-        </w:rPr>
-        <w:t xml:space="preserve">A javaslat ezért kötelező pilot-mérést ír elő</w:t>
-      </w:r>
-      <w:r>
-        <w:t xml:space="preserve"> (lásd 6./IV.), amelynek eredménye a műveleti szakasz indítása előtt rendelkezésre áll.</w:t>
-      </w:r>
-    </w:p>
-    <w:p>
-      <w:pPr>
-        <w:spacing w:after="140"/>
-        <w:jc w:val="both"/>
-      </w:pPr>
-      <w:r>
-        <w:t xml:space="preserve">A pilot néhány száz pedagógussal, több intézménytípusban, a következőket méri:</w:t>
-      </w:r>
-    </w:p>
-    <w:p>
-      <w:pPr>
-        <w:pStyle w:val="ListParagraph"/>
-        <w:numPr>
-          <w:ilvl w:val="0"/>
-          <w:numId w:val="2"/>
-        </w:numPr>
-        <w:spacing w:after="60"/>
-      </w:pPr>
-      <w:r>
-        <w:rPr>
-          <w:b/>
-          <w:bCs/>
-        </w:rPr>
-        <w:t xml:space="preserve">Mire megy ma az adminisztrációs idő</w:t>
-      </w:r>
-      <w:r>
-        <w:t xml:space="preserve">, folyamatonként bontva: napló, jegyrögzítés, szöveges értékelés, mulasztáskövetés, szülői kommunikáció, időszaki összesítés.</w:t>
-      </w:r>
-    </w:p>
-    <w:p>
-      <w:pPr>
-        <w:pStyle w:val="ListParagraph"/>
-        <w:numPr>
-          <w:ilvl w:val="0"/>
-          <w:numId w:val="2"/>
-        </w:numPr>
-        <w:spacing w:after="60"/>
-      </w:pPr>
-      <w:r>
-        <w:rPr>
-          <w:b/>
-          <w:bCs/>
-        </w:rPr>
-        <w:t xml:space="preserve">Mely folyamatok igényelnek tanulmányi rendszerből adatot</w:t>
-      </w:r>
-      <w:r>
-        <w:t xml:space="preserve"> — ez adja az „érinthető arány” tényleges értékét.</w:t>
-      </w:r>
-    </w:p>
-    <w:p>
-      <w:pPr>
-        <w:pStyle w:val="ListParagraph"/>
-        <w:numPr>
-          <w:ilvl w:val="0"/>
-          <w:numId w:val="2"/>
-        </w:numPr>
-        <w:spacing w:after="60"/>
-      </w:pPr>
-      <w:r>
-        <w:rPr>
-          <w:b/>
-          <w:bCs/>
-        </w:rPr>
-        <w:t xml:space="preserve">Ugyanaz a folyamat mennyi idő integrált MI-vel</w:t>
-      </w:r>
-      <w:r>
-        <w:t xml:space="preserve"> — ahol lehetséges, hasonló feladatot végző kontrollcsoporttal összevetve. Ez adja az időnyereséget.</w:t>
-      </w:r>
-    </w:p>
-    <w:p>
-      <w:pPr>
-        <w:pStyle w:val="ListParagraph"/>
-        <w:numPr>
-          <w:ilvl w:val="0"/>
-          <w:numId w:val="2"/>
-        </w:numPr>
-        <w:spacing w:after="60"/>
-      </w:pPr>
-      <w:r>
-        <w:rPr>
-          <w:b/>
-          <w:bCs/>
-        </w:rPr>
-        <w:t xml:space="preserve">Mekkora az utóellenőrzési idő</w:t>
-      </w:r>
-      <w:r>
-        <w:t xml:space="preserve">: mennyit tölt a pedagógus az MI kimenetének átnézésével és javításával. E nélkül a nyereség túlbecsült.</w:t>
-      </w:r>
-    </w:p>
-    <w:p>
-      <w:pPr>
-        <w:pStyle w:val="ListParagraph"/>
-        <w:numPr>
-          <w:ilvl w:val="0"/>
-          <w:numId w:val="2"/>
-        </w:numPr>
-        <w:spacing w:after="60"/>
-      </w:pPr>
-      <w:r>
-        <w:rPr>
-          <w:b/>
-          <w:bCs/>
-        </w:rPr>
-        <w:t xml:space="preserve">Változik-e a hibaarány</w:t>
-      </w:r>
-      <w:r>
-        <w:t xml:space="preserve"> a rögzített adatokban és a kimenő kommunikációban — javul, romlik vagy marad.</w:t>
-      </w:r>
-    </w:p>
-    <w:p>
-      <w:pPr>
-        <w:spacing w:after="140"/>
-        <w:jc w:val="both"/>
-      </w:pPr>
-      <w:r>
-        <w:t xml:space="preserve">Az ötödik pont a legfontosabb. Egy gyorsabb, de hibásabb adminisztráció nem nyereség. A pilotnak ezért nemcsak időt, hanem minőséget is mérnie kell.</w:t>
-      </w:r>
-    </w:p>
-    <w:p>
-      <w:pPr>
-        <w:spacing w:after="140"/>
-        <w:jc w:val="both"/>
-      </w:pPr>
-      <w:r>
-        <w:t xml:space="preserve">Ezután a hatásvizsgálat nem feltételezett arányokra, hanem magyar mérésre épül.</w:t>
+        <w:t xml:space="preserve">3.2 A pilot</w:t>
+      </w:r>
+    </w:p>
+    <w:p>
+      <w:pPr>
+        <w:spacing w:after="140"/>
+        <w:jc w:val="both"/>
+      </w:pPr>
+      <w:r>
+        <w:t xml:space="preserve">A fenti számítás legnagyobb gyengesége, hogy magyar mérés nélkül készült, ezért a javaslat kötelező pilot-mérést ír elő a 6./IV. pont szerint, amelynek eredménye a műveleti szakasz indítása előtt rendelkezésre áll.</w:t>
+      </w:r>
+    </w:p>
+    <w:p>
+      <w:pPr>
+        <w:spacing w:after="140"/>
+        <w:jc w:val="both"/>
+      </w:pPr>
+      <w:r>
+        <w:t xml:space="preserve">A pilot néhány száz pedagógussal, több intézménytípusban zajlik, és öt kérdést mér. Hogy mire megy ma az adminisztrációs idő, folyamatonként bontva: napló, jegyrögzítés, szöveges értékelés, mulasztáskövetés, szülői kommunikáció, időszaki összesítés. Hogy mely folyamatok igényelnek tanulmányi rendszerből adatot, ami az érinthető arány tényleges értékét adja. Hogy ugyanaz a folyamat mennyi idő integrált MI-vel, ahol lehetséges hasonló feladatot végző kontrollcsoporttal összevetve. Hogy mekkora az utóellenőrzési idő, vagyis mennyit tölt a pedagógus az MI kimenetének átnézésével és javításával, mert e nélkül a nyereség túlbecsült marad. Végül hogy változik-e a hibaarány a rögzített adatokban és a kimenő kommunikációban.</w:t>
+      </w:r>
+    </w:p>
+    <w:p>
+      <w:pPr>
+        <w:spacing w:after="140"/>
+        <w:jc w:val="both"/>
+      </w:pPr>
+      <w:r>
+        <w:t xml:space="preserve">Az utolsó kérdés érdemben is fontos, mert egy gyorsabb, de hibásabb adminisztráció nem eredmény. A pilotnak ezért időt és minőséget egyaránt mérnie kell, és ezután a hatásvizsgálat már magyar mérésre épülhet.</w:t>
       </w:r>
     </w:p>
     <w:p>
@@ -2990,35 +1831,25 @@
         <w:spacing w:after="160" w:before="320"/>
       </w:pPr>
       <w:r>
-        <w:t xml:space="preserve">3.3 Biztonsági és adatvédelmi kockázat — feltételezés, szerkezeti okból mérhetetlen</w:t>
-      </w:r>
-    </w:p>
-    <w:p>
-      <w:pPr>
-        <w:spacing w:after="140"/>
-        <w:jc w:val="both"/>
-      </w:pPr>
-      <w:r>
-        <w:t xml:space="preserve">Hogy hány szülő adta át a KRÉTA-jelszavát harmadik félnek, és hány pedagógus másol tanulói adatot magáncélú MI-fiókba, arról nincs adat. Ezt nem tényként állítjuk, hanem a probléma természeteként: </w:t>
-      </w:r>
-      <w:r>
-        <w:rPr>
-          <w:b/>
-          <w:bCs/>
-        </w:rPr>
-        <w:t xml:space="preserve">az adatkezelő iskola sem tudja</w:t>
-      </w:r>
-      <w:r>
-        <w:t xml:space="preserve">, mert a jelenség nem hagy nyomot a rendszerben. Egyetlen pedagógus egyetlen másolással egy teljes osztálynyi tanuló adatát viheti ki szerződés nélkül. [ELLENŐRIZENDŐ: átlagos osztálylétszám, KSH]</w:t>
-      </w:r>
-    </w:p>
-    <w:p>
-      <w:pPr>
-        <w:spacing w:after="140"/>
-        <w:jc w:val="both"/>
-      </w:pPr>
-      <w:r>
-        <w:t xml:space="preserve">A javaslat ezen a ponton önmagában is hoz eredményt: bevezetése után minden felhatalmazás naplózott, megtekinthető és megszámlálható lesz — akkor is, ha kiderül, hogy a jelenség a feltételezettnél ritkább.</w:t>
+        <w:t xml:space="preserve">3.3 Biztonsági és adatvédelmi kockázat, feltételezés</w:t>
+      </w:r>
+    </w:p>
+    <w:p>
+      <w:pPr>
+        <w:spacing w:after="140"/>
+        <w:jc w:val="both"/>
+      </w:pPr>
+      <w:r>
+        <w:t xml:space="preserve">Arról, hogy hány szülő adta át a KRÉTA-jelszavát harmadik félnek, és hány pedagógus másol tanulói adatot magáncélú MI-fiókba, nincs adat. Ez a probléma természetéből következik, hiszen az adatkezelő iskola sem tudja, mert a jelenség nem hagy nyomot a rendszerben. Egyetlen pedagógus egyetlen másolással egy teljes osztálynyi tanuló adatát viheti ki szerződés nélkül. [ELLENŐRIZENDŐ: átlagos osztálylétszám, KSH]</w:t>
+      </w:r>
+    </w:p>
+    <w:p>
+      <w:pPr>
+        <w:spacing w:after="140"/>
+        <w:jc w:val="both"/>
+      </w:pPr>
+      <w:r>
+        <w:t xml:space="preserve">A javaslat ezen a ponton önmagában is hoz eredményt, mert bevezetése után minden felhatalmazás naplózott, megtekinthető és megszámlálható lesz, akkor is, ha kiderül, hogy a jelenség a feltételezettnél ritkább.</w:t>
       </w:r>
     </w:p>
     <w:p>
@@ -3027,26 +1858,16 @@
         <w:spacing w:after="160" w:before="320"/>
       </w:pPr>
       <w:r>
-        <w:t xml:space="preserve">3.4 Esélyegyenlőségi kár — feltételezés</w:t>
-      </w:r>
-    </w:p>
-    <w:p>
-      <w:pPr>
-        <w:spacing w:after="140"/>
-        <w:jc w:val="both"/>
-      </w:pPr>
-      <w:r>
-        <w:t xml:space="preserve">Az MI-asszisztens feltehetően azoknak a szülőknek segít a legtöbbet, akiknek az iskolai rendszerek kezelése ma nehézséget okoz: kevésbé gyakorlott digitális felhasználóknak, több gyermeket nevelő, időhiányos családoknak, nem magyar anyanyelvű szülőknek. Ha ez igaz, akkor hivatalos út hiányában éppen ők maradnak ki, vagy ők vállalják a legnagyobb kockázatot. </w:t>
-      </w:r>
-      <w:r>
-        <w:rPr>
-          <w:b/>
-          <w:bCs/>
-        </w:rPr>
-        <w:t xml:space="preserve">Ezt az állítást hazai adat nem támasztja alá</w:t>
-      </w:r>
-      <w:r>
-        <w:t xml:space="preserve">; a hatásmérés egyik kérdése éppen ez legyen.</w:t>
+        <w:t xml:space="preserve">3.4 Esélyegyenlőségi kár, feltételezés</w:t>
+      </w:r>
+    </w:p>
+    <w:p>
+      <w:pPr>
+        <w:spacing w:after="140"/>
+        <w:jc w:val="both"/>
+      </w:pPr>
+      <w:r>
+        <w:t xml:space="preserve">Az MI-asszisztens feltehetően azoknak a szülőknek segít a legtöbbet, akiknek az iskolai rendszerek kezelése ma nehézséget okoz: a kevésbé gyakorlott digitális felhasználóknak, a több gyermeket nevelő, időhiányos családoknak és a nem magyar anyanyelvű szülőknek. Ha ez így van, akkor hivatalos út hiányában éppen ők maradnak ki, vagy ők vállalják a legnagyobb kockázatot. Ezt az állítást hazai adat nem támasztja alá, és a hatásmérés egyik kérdése éppen ez legyen.</w:t>
       </w:r>
     </w:p>
     <w:p>
@@ -3055,16 +1876,16 @@
         <w:spacing w:after="160" w:before="320"/>
       </w:pPr>
       <w:r>
-        <w:t xml:space="preserve">3.5 Innovációs kár — részben dokumentált</w:t>
-      </w:r>
-    </w:p>
-    <w:p>
-      <w:pPr>
-        <w:spacing w:after="140"/>
-        <w:jc w:val="both"/>
-      </w:pPr>
-      <w:r>
-        <w:t xml:space="preserve">Hazai fejlesztő ma nem tud stabil, jogszerű terméket építeni az oktatási rendszerekre, mert nincs dokumentált felület, és az üzemeltető a nem hivatalos klienst rendellenesnek minősíti (1.4). A meglévő megoldások egy rendszerfrissítéssel megszűnhetnek. Hogy ez konkrétan hány vállalkozást tartott vissza, arról nincs felmérés; a mechanizmus azonban az 1.6 pontban leírt működési kényszerekből közvetlenül látszik.</w:t>
+        <w:t xml:space="preserve">3.5 Innovációs kár, részben dokumentált</w:t>
+      </w:r>
+    </w:p>
+    <w:p>
+      <w:pPr>
+        <w:spacing w:after="140"/>
+        <w:jc w:val="both"/>
+      </w:pPr>
+      <w:r>
+        <w:t xml:space="preserve">Hazai fejlesztő ma nem tud stabil, jogszerű terméket építeni az oktatási rendszerekre, mert nincs dokumentált felület, és az üzemeltető a nem hivatalos klienst rendellenesnek minősíti az 1.4 pont szerint. A meglévő megoldások egy rendszerfrissítéssel megszűnhetnek. Hogy ez konkrétan hány vállalkozást tartott vissza, arról nincs felmérés, a mechanizmus azonban az 1.6 pontban leírt működési kényszerekből közvetlenül látszik.</w:t>
       </w:r>
     </w:p>
     <w:p>
@@ -3093,74 +1914,34 @@
         <w:spacing w:after="160" w:before="320"/>
       </w:pPr>
       <w:r>
-        <w:t xml:space="preserve">4.1 Cél 1: a meglévő hozzáférés delegálható legyen — meghatározott funkciókörben</w:t>
-      </w:r>
-    </w:p>
-    <w:p>
-      <w:pPr>
-        <w:spacing w:after="140"/>
-        <w:jc w:val="both"/>
-      </w:pPr>
-      <w:r>
-        <w:t xml:space="preserve">A hozzáférés </w:t>
-      </w:r>
-      <w:r>
-        <w:rPr>
-          <w:b/>
-          <w:bCs/>
-        </w:rPr>
-        <w:t xml:space="preserve">körét</w:t>
-      </w:r>
-      <w:r>
-        <w:t xml:space="preserve"> nem kell újraszabályozni: azt a rendszerek meglévő jogosultságkezelése eldönti. Amit szabályozni kell, az a </w:t>
-      </w:r>
-      <w:r>
-        <w:rPr>
-          <w:b/>
-          <w:bCs/>
-        </w:rPr>
-        <w:t xml:space="preserve">csatorna</w:t>
-      </w:r>
-      <w:r>
-        <w:t xml:space="preserve"> és a </w:t>
-      </w:r>
-      <w:r>
-        <w:rPr>
-          <w:b/>
-          <w:bCs/>
-        </w:rPr>
-        <w:t xml:space="preserve">felhasználás</w:t>
-      </w:r>
-      <w:r>
-        <w:t xml:space="preserve">.</w:t>
-      </w:r>
-    </w:p>
-    <w:p>
-      <w:pPr>
-        <w:spacing w:after="140"/>
-        <w:jc w:val="both"/>
-      </w:pPr>
-      <w:r>
-        <w:t xml:space="preserve">Teljes funkcióparitást nem ígérünk: a felületi és a programozói funkciók nem képezhetők le mindig egy az egyben, és egy jövőbeli, különösen érzékeny új funkció automatikus megnyílása nem vállalható. Helyette </w:t>
-      </w:r>
-      <w:r>
-        <w:rPr>
-          <w:b/>
-          <w:bCs/>
-        </w:rPr>
-        <w:t xml:space="preserve">funkciókatalógust</w:t>
-      </w:r>
-      <w:r>
-        <w:t xml:space="preserve"> javaslunk, a PSD2 mintájára.</w:t>
-      </w:r>
-    </w:p>
-    <w:p>
-      <w:pPr>
-        <w:spacing w:after="140"/>
-        <w:jc w:val="both"/>
-      </w:pPr>
-      <w:r>
-        <w:t xml:space="preserve">A kormányrendelet melléklete tételesen felsorolja a delegált hozzáféréssel elérhető funkciókat, és mindegyikhez hozzárendeli a szükséges bizalmi szintet és a melléklet M4.3 pontja szerinti adatkör-besorolást. Új hivatalos funkció megjelenésekor az üzemeltető 90 napon belül besorolási javaslatot tesz; a katalógust a miniszter évente felülvizsgálja.</w:t>
+        <w:t xml:space="preserve">4.1 A meglévő hozzáférés delegálható legyen, meghatározott funkciókörben</w:t>
+      </w:r>
+    </w:p>
+    <w:p>
+      <w:pPr>
+        <w:spacing w:after="140"/>
+        <w:jc w:val="both"/>
+      </w:pPr>
+      <w:r>
+        <w:t xml:space="preserve">A hozzáférés körét nem szükséges újraszabályozni, mert azt a rendszerek meglévő jogosultságkezelése eldönti. Szabályozásra a csatorna és a felhasználás szorul.</w:t>
+      </w:r>
+    </w:p>
+    <w:p>
+      <w:pPr>
+        <w:spacing w:after="140"/>
+        <w:jc w:val="both"/>
+      </w:pPr>
+      <w:r>
+        <w:t xml:space="preserve">Teljes funkcióparitást nem ígérünk. A felületi és a programozói funkciók nem képezhetők le mindig egy az egyben, és egy jövőbeli, különösen érzékeny új funkció automatikus megnyílása nem vállalható. Helyette funkciókatalógust javaslunk, a PSD2 mintájára, amely szintén meghatározott szolgáltatásokhoz szabályoz hozzáférést.</w:t>
+      </w:r>
+    </w:p>
+    <w:p>
+      <w:pPr>
+        <w:spacing w:after="140"/>
+        <w:jc w:val="both"/>
+      </w:pPr>
+      <w:r>
+        <w:t xml:space="preserve">A kormányrendelet melléklete tételesen felsorolja a delegált hozzáféréssel elérhető funkciókat, és mindegyikhez hozzárendeli a szükséges bizalmi szintet, valamint a melléklet M4.3 pontja szerinti adatkör-besorolást. Új hivatalos funkció megjelenésekor az üzemeltető kilencven napon belül besorolási javaslatot tesz, a katalógust pedig a miniszter évente felülvizsgálja.</w:t>
       </w:r>
     </w:p>
     <w:p>
@@ -3176,27 +1957,7 @@
         <w:t xml:space="preserve">Mérhető célok:</w:t>
       </w:r>
       <w:r>
-        <w:t xml:space="preserve"> a katalógus 2027. szeptember 1-jén lefedi a hivatalos alkalmazások </w:t>
-      </w:r>
-      <w:r>
-        <w:rPr>
-          <w:b/>
-          <w:bCs/>
-        </w:rPr>
-        <w:t xml:space="preserve">olvasási</w:t>
-      </w:r>
-      <w:r>
-        <w:t xml:space="preserve"> funkcióinak 100%-át az alapadatkörben; 2028. szeptember 1-jén tartalmazza a </w:t>
-      </w:r>
-      <w:r>
-        <w:rPr>
-          <w:b/>
-          <w:bCs/>
-        </w:rPr>
-        <w:t xml:space="preserve">műveleti</w:t>
-      </w:r>
-      <w:r>
-        <w:t xml:space="preserve"> funkciók besorolását, és jelszóátadásra egyetlen katalógusbeli funkcióhoz sincs szükség.</w:t>
+        <w:t xml:space="preserve"> a katalógus 2027. szeptember 1-jén lefedi a hivatalos alkalmazások olvasási funkcióinak 100%-át az alapadatkörben; 2028. szeptember 1-jén tartalmazza a műveleti funkciók besorolását, és jelszóátadásra egyetlen katalógusbeli funkcióhoz sincs szükség.</w:t>
       </w:r>
     </w:p>
     <w:p>
@@ -3205,26 +1966,16 @@
         <w:spacing w:after="160" w:before="320"/>
       </w:pPr>
       <w:r>
-        <w:t xml:space="preserve">4.2 Cél 2: a felület legyen nyilvános, stabil és megkülönböztetésmentes</w:t>
-      </w:r>
-    </w:p>
-    <w:p>
-      <w:pPr>
-        <w:spacing w:after="140"/>
-        <w:jc w:val="both"/>
-      </w:pPr>
-      <w:r>
-        <w:t xml:space="preserve">A dokumentáció legyen nyilvános, verziózott, tesztkörnyezettel. A nyilvánosság a </w:t>
-      </w:r>
-      <w:r>
-        <w:rPr>
-          <w:b/>
-          <w:bCs/>
-        </w:rPr>
-        <w:t xml:space="preserve">specifikációra</w:t>
-      </w:r>
-      <w:r>
-        <w:t xml:space="preserve"> vonatkozik; az adathoz való hozzáférés hitelesített és a felhasználó jogosultságához kötött marad. A megkülönböztetésmentesség tartalmát a melléklet M3.2 pontja adja.</w:t>
+        <w:t xml:space="preserve">4.2 A felület legyen nyilvános, stabil és megkülönböztetésmentes</w:t>
+      </w:r>
+    </w:p>
+    <w:p>
+      <w:pPr>
+        <w:spacing w:after="140"/>
+        <w:jc w:val="both"/>
+      </w:pPr>
+      <w:r>
+        <w:t xml:space="preserve">A dokumentáció legyen nyilvános, verziózott és tesztkörnyezettel ellátott. A nyilvánosság a specifikációra vonatkozik, az adathoz való hozzáférés pedig hitelesített és a felhasználó jogosultságához kötött marad. A megkülönböztetésmentesség tartalmát a melléklet M3.2 pontja adja meg.</w:t>
       </w:r>
     </w:p>
     <w:p>
@@ -3240,7 +1991,7 @@
         <w:t xml:space="preserve">Mérhető célok:</w:t>
       </w:r>
       <w:r>
-        <w:t xml:space="preserve"> a dokumentáció és a szintetikus adatokat tartalmazó tesztkörnyezet 2027. június 30-ig publikus; a visszafelé nem kompatibilis változásokat legalább 90 nappal előre bejelentik.</w:t>
+        <w:t xml:space="preserve"> a dokumentáció és a szintetikus adatokat tartalmazó tesztkörnyezet 2027. június 30-ig publikus; a visszafelé nem kompatibilis változásokat legalább kilencven nappal előre bejelentik.</w:t>
       </w:r>
     </w:p>
     <w:p>
@@ -3265,208 +2016,52 @@
         <w:spacing w:after="160" w:before="320"/>
       </w:pPr>
       <w:r>
-        <w:t xml:space="preserve">4.3 Cél 3: a pedagógusi MI-használat legyen intézményileg megszervezhető</w:t>
-      </w:r>
-    </w:p>
-    <w:p>
-      <w:pPr>
-        <w:spacing w:after="140"/>
-        <w:jc w:val="both"/>
-      </w:pPr>
-      <w:r>
-        <w:t xml:space="preserve">Ez a javaslat szakpolitikai magja, ezért nem jogi levezetéssel indokoljuk.</w:t>
-      </w:r>
-    </w:p>
-    <w:p>
-      <w:pPr>
-        <w:spacing w:after="140"/>
-        <w:jc w:val="both"/>
-      </w:pPr>
-      <w:r>
-        <w:rPr>
-          <w:b/>
-          <w:bCs/>
-        </w:rPr>
-        <w:t xml:space="preserve">Az MI-jártasság nem pusztán képzési kérdés.</w:t>
-      </w:r>
-      <w:r>
-        <w:t xml:space="preserve"> Tanfolyamon meg lehet tanulni, mi az a nyelvi modell. Azt, hogy egy konkrét kimenetben hol lehet megbízni és hol nem, csak a saját munkán lehet megtanulni. Egy pedagógus akkor tud az MI-vel szakmailag és kritikusan bánni, ha az a </w:t>
-      </w:r>
-      <w:r>
-        <w:rPr>
-          <w:b/>
-          <w:bCs/>
-        </w:rPr>
-        <w:t xml:space="preserve">tényleges munkafolyamataiban</w:t>
-      </w:r>
-      <w:r>
-        <w:t xml:space="preserve"> jogszerűen használható. Amíg nem az, addig vagy nem használja, vagy szabálytalanul használja — és mindkét esetben megmarad kívülállónak azzal az eszközzel szemben, amelyről később szakmai döntéseket kellene hoznia.</w:t>
-      </w:r>
-    </w:p>
-    <w:p>
-      <w:pPr>
-        <w:spacing w:after="140"/>
-        <w:jc w:val="both"/>
-      </w:pPr>
-      <w:r>
-        <w:rPr>
-          <w:b/>
-          <w:bCs/>
-        </w:rPr>
-        <w:t xml:space="preserve">Ne még egy felület legyen.</w:t>
-      </w:r>
-      <w:r>
-        <w:t xml:space="preserve"> Ha az MI külön alkalmazásként érkezik, amelyet meg kell nyitni és amelybe kézzel kell bemásolni az adatot, akkor csak eggyel több rendszer lesz abban a sorban, amely már most is túl hosszú. Akkor lesz használható, ha </w:t>
-      </w:r>
-      <w:r>
-        <w:rPr>
-          <w:b/>
-          <w:bCs/>
-        </w:rPr>
-        <w:t xml:space="preserve">hozzáfér a pedagógus által amúgy is használt rendszerekhez</w:t>
-      </w:r>
-      <w:r>
-        <w:t xml:space="preserve">, és természetes nyelvű munkafelületet ad föléjük. Nem az embernek kell a rendszerekhez járnia; a rendszerek adata jön az emberhez.</w:t>
-      </w:r>
-    </w:p>
-    <w:p>
-      <w:pPr>
-        <w:spacing w:after="140"/>
-        <w:jc w:val="both"/>
-      </w:pPr>
-      <w:r>
-        <w:rPr>
-          <w:b/>
-          <w:bCs/>
-        </w:rPr>
-        <w:t xml:space="preserve">Nem csak gyorsítás.</w:t>
-      </w:r>
-      <w:r>
-        <w:t xml:space="preserve"> Az adminisztráció rövidítése a legkönnyebben mérhető haszon, de nem a legfontosabb. Egy tanulmányi rendszerhez kapcsolt, felügyelt MI segíthet:</w:t>
-      </w:r>
-    </w:p>
-    <w:p>
-      <w:pPr>
-        <w:pStyle w:val="ListParagraph"/>
-        <w:numPr>
-          <w:ilvl w:val="0"/>
-          <w:numId w:val="1"/>
-        </w:numPr>
-        <w:spacing w:after="60"/>
-      </w:pPr>
-      <w:r>
-        <w:rPr>
-          <w:b/>
-          <w:bCs/>
-        </w:rPr>
-        <w:t xml:space="preserve">áttekinteni a lemaradásra utaló, a pedagógus számára amúgy is rendelkezésre álló jeleket</w:t>
-      </w:r>
-      <w:r>
-        <w:t xml:space="preserve"> — a jegyeket, hiányzásokat és határidőket együtt, ahelyett hogy három felületen kellene összenéznie őket;</w:t>
-      </w:r>
-    </w:p>
-    <w:p>
-      <w:pPr>
-        <w:pStyle w:val="ListParagraph"/>
-        <w:numPr>
-          <w:ilvl w:val="0"/>
-          <w:numId w:val="1"/>
-        </w:numPr>
-        <w:spacing w:after="60"/>
-      </w:pPr>
-      <w:r>
-        <w:rPr>
-          <w:b/>
-          <w:bCs/>
-        </w:rPr>
-        <w:t xml:space="preserve">szülői kommunikációt előkészíteni</w:t>
-      </w:r>
-      <w:r>
-        <w:t xml:space="preserve"> — tényszerű összefoglalót adni arról, mi történt egy tanulóval az elmúlt hetekben;</w:t>
-      </w:r>
-    </w:p>
-    <w:p>
-      <w:pPr>
-        <w:pStyle w:val="ListParagraph"/>
-        <w:numPr>
-          <w:ilvl w:val="0"/>
-          <w:numId w:val="1"/>
-        </w:numPr>
-        <w:spacing w:after="60"/>
-      </w:pPr>
-      <w:r>
-        <w:rPr>
-          <w:b/>
-          <w:bCs/>
-        </w:rPr>
-        <w:t xml:space="preserve">időszaki összesítéseket készíteni</w:t>
-      </w:r>
-      <w:r>
-        <w:t xml:space="preserve"> félévi és év végi zárásra;</w:t>
-      </w:r>
-    </w:p>
-    <w:p>
-      <w:pPr>
-        <w:pStyle w:val="ListParagraph"/>
-        <w:numPr>
-          <w:ilvl w:val="0"/>
-          <w:numId w:val="1"/>
-        </w:numPr>
-        <w:spacing w:after="60"/>
-      </w:pPr>
-      <w:r>
-        <w:rPr>
-          <w:b/>
-          <w:bCs/>
-        </w:rPr>
-        <w:t xml:space="preserve">szöveges értékelést támogatni</w:t>
-      </w:r>
-      <w:r>
-        <w:t xml:space="preserve"> — a megfogalmazás első változatával, amelyet a pedagógus felülír.</w:t>
-      </w:r>
-    </w:p>
-    <w:p>
-      <w:pPr>
-        <w:spacing w:after="140"/>
-        <w:jc w:val="both"/>
-      </w:pPr>
-      <w:r>
-        <w:t xml:space="preserve">Mindegyikben a rögzítés és a szakmai döntés a pedagógusnál marad. Az MI nem osztályoz és nem dönt.</w:t>
-      </w:r>
-    </w:p>
-    <w:p>
-      <w:pPr>
-        <w:spacing w:after="140"/>
-        <w:jc w:val="both"/>
-      </w:pPr>
-      <w:r>
-        <w:rPr>
-          <w:b/>
-          <w:bCs/>
-        </w:rPr>
-        <w:t xml:space="preserve">Amit a zártság valójában akadályoz.</w:t>
-      </w:r>
-      <w:r>
-        <w:t xml:space="preserve"> A jelenlegi helyzet nem az ellenőrizetlen MI-használatot akadályozza — a kimásolást semmi nem állítja meg. Amit megakadályoz, az a </w:t>
-      </w:r>
-      <w:r>
-        <w:rPr>
-          <w:b/>
-          <w:bCs/>
-        </w:rPr>
-        <w:t xml:space="preserve">mindennapi, kontrollált, intézményileg engedélyezett és naplózott</w:t>
-      </w:r>
-      <w:r>
-        <w:t xml:space="preserve"> használat. A zárt rendszer tehát pontosan a kívánatos változatot zárja ki, a nem kívánatosat pedig nem.</w:t>
-      </w:r>
-    </w:p>
-    <w:p>
-      <w:pPr>
-        <w:spacing w:after="140"/>
-        <w:jc w:val="both"/>
-      </w:pPr>
-      <w:r>
-        <w:t xml:space="preserve">Hogy az eszköz állami fejlesztésű, központilag beszerzett vagy fenntartói szerződéssel biztosított, a javaslat szempontjából közömbös: mindegyik ugyanazon a nyilvános felületen, a 3. bizalmi szinten kapcsolódik.</w:t>
+        <w:t xml:space="preserve">4.3 A pedagógusi MI-használat legyen intézményileg megszervezhető</w:t>
+      </w:r>
+    </w:p>
+    <w:p>
+      <w:pPr>
+        <w:spacing w:after="140"/>
+        <w:jc w:val="both"/>
+      </w:pPr>
+      <w:r>
+        <w:t xml:space="preserve">Ez a javaslat szakpolitikai magja, és az indoklása is szakpolitikai.</w:t>
+      </w:r>
+    </w:p>
+    <w:p>
+      <w:pPr>
+        <w:spacing w:after="140"/>
+        <w:jc w:val="both"/>
+      </w:pPr>
+      <w:r>
+        <w:t xml:space="preserve">Az MI-jártasság nem pusztán képzési kérdés. Tanfolyamon meg lehet tanulni, mi az a nyelvi modell, de azt, hogy egy konkrét kimenetben hol lehet megbízni, csak a saját munkán lehet megtanulni. A pedagógus akkor tud az MI-vel szakmailag és kritikusan bánni, ha az a tényleges munkafolyamataiban jogszerűen használható. Amíg ez a feltétel hiányzik, vagy nem használja, vagy szabálytalanul használja, és mindkét esetben kívülálló marad azzal az eszközzel szemben, amelyről később szakmai döntéseket kellene hoznia.</w:t>
+      </w:r>
+    </w:p>
+    <w:p>
+      <w:pPr>
+        <w:spacing w:after="140"/>
+        <w:jc w:val="both"/>
+      </w:pPr>
+      <w:r>
+        <w:t xml:space="preserve">Az is számít, hogyan érkezik az eszköz. Ha az MI külön alkalmazásként jelenik meg, amelyet meg kell nyitni és amelybe kézzel kell bemásolni az adatot, akkor csak eggyel több rendszer kerül egy már most is hosszú sorba. Akkor válik használhatóvá, ha hozzáfér a pedagógus által amúgy is használt rendszerekhez, és természetes nyelvű munkafelületet ad föléjük, hogy a rendszerek adata jusson el az emberhez.</w:t>
+      </w:r>
+    </w:p>
+    <w:p>
+      <w:pPr>
+        <w:spacing w:after="140"/>
+        <w:jc w:val="both"/>
+      </w:pPr>
+      <w:r>
+        <w:t xml:space="preserve">Az adminisztráció rövidítése a legkönnyebben mérhető haszon, de nem a legfontosabb. Egy tanulmányi rendszerhez kapcsolt, felügyelt MI segíthet egy helyen áttekinteni a lemaradásra utaló, a pedagógus számára amúgy is rendelkezésre álló jeleket, vagyis a jegyeket, a hiányzásokat és a határidőket, amelyek ma külön felületeken állnak. Segíthet előkészíteni a szülői kommunikációt, tényszerű összefoglalót adva arról, mi történt egy tanulóval az elmúlt hetekben. Segíthet az időszaki összesítésekben a félévi és év végi zárásnál, és támogathatja a szöveges értékelést egy első megfogalmazással, amelyet a pedagógus felülír. A rögzítés és a szakmai döntés minden esetben a pedagógusnál marad.</w:t>
+      </w:r>
+    </w:p>
+    <w:p>
+      <w:pPr>
+        <w:spacing w:after="140"/>
+        <w:jc w:val="both"/>
+      </w:pPr>
+      <w:r>
+        <w:t xml:space="preserve">A jelenlegi zártság elsősorban a mindennapi, kontrollált, intézményileg engedélyezett és naplózott használatot zárja ki. A kimásolásos gyakorlatra nincs hatással. Hogy az eszköz állami fejlesztésű, központilag beszerzett vagy fenntartói szerződéssel biztosított, a javaslat szempontjából közömbös, mert mindegyik ugyanazon a nyilvános felületen, a harmadik bizalmi szinten kapcsolódik.</w:t>
       </w:r>
     </w:p>
     <w:p>
@@ -3491,7 +2086,7 @@
         <w:spacing w:after="160" w:before="320"/>
       </w:pPr>
       <w:r>
-        <w:t xml:space="preserve">4.4 Cél 4: a felhasználó tudja, mi történik az adatával</w:t>
+        <w:t xml:space="preserve">4.4 A felhasználó tudja, mi történik az adatával</w:t>
       </w:r>
     </w:p>
     <w:p>
@@ -3507,7 +2102,7 @@
         <w:t xml:space="preserve">Mérhető célok:</w:t>
       </w:r>
       <w:r>
-        <w:t xml:space="preserve"> 2027. szeptember 1-jétől minden felhatalmazás a melléklet M4.2 pontja szerinti, köznyelvi tájékoztatással jön létre; a felhatalmazások 100%-a megtekinthető és visszavonható a hivatalos felületen; 2029-től évente nyilvános jelentés a regisztrált kliensekről bizalmi szintenként, az aktív felhatalmazásokról, a visszavonásokról, a kliensfelfüggesztésekről és a biztonsági incidensekről.</w:t>
+        <w:t xml:space="preserve"> 2027. szeptember 1-jétől minden felhatalmazás a melléklet M4.2 pontja szerinti, köznyelvi tájékoztatással jön létre; a felhatalmazások 100%-a megtekinthető és visszavonható a hivatalos felületen; 2029-től évente nyilvános jelentés készül a regisztrált kliensekről bizalmi szintenként, az aktív felhatalmazásokról, a visszavonásokról, a kliensfelfüggesztésekről és a biztonsági incidensekről.</w:t>
       </w:r>
     </w:p>
     <w:p>
@@ -3701,7 +2296,7 @@
                 <w:sz w:val="18"/>
                 <w:szCs w:val="18"/>
               </w:rPr>
-              <w:t xml:space="preserve">a kevésbé gyakorlott digitális felhasználók és a nem magyar anyanyelvű családok is könnyebben követik az iskolai ügyeket (3.4 szerint feltételezés)</w:t>
+              <w:t xml:space="preserve">a kevésbé gyakorlott digitális felhasználók és a nem magyar anyanyelvű családok is könnyebben követik az iskolai ügyeket (a 3.4 pont szerint feltételezés)</w:t>
             </w:r>
           </w:p>
         </w:tc>
@@ -4177,7 +2772,7 @@
         <w:jc w:val="both"/>
       </w:pPr>
       <w:r>
-        <w:t xml:space="preserve">Az üzemeltetői oldalon a bevezetés a meglévő felületekre és a már OAuth-alapú hitelesítési infrastruktúrára építhet, de új kliensregisztrációs, felhatalmazás-kezelési, dokumentációs, biztonsági és üzemeltetési képességeket igényel — köztük kérésszám-korlátozást, visszaélés-felismerést, felügyeletet, tesztkörnyezet-fenntartást és fejlesztői támogatást. Ezek ráfordítását a 8. fejezet nyitott kérdésként kezeli.</w:t>
+        <w:t xml:space="preserve">Az üzemeltetői oldalon a bevezetés a meglévő felületekre és a már OAuth-alapú hitelesítési infrastruktúrára építhet. Emellett új kliensregisztrációs, felhatalmazás-kezelési, dokumentációs, biztonsági és üzemeltetési képességeket igényel, köztük kérésszám-korlátozást, visszaélés-felismerést, felügyeletet, tesztkörnyezet-fenntartást és fejlesztői támogatást. Ezek ráfordítását a 8. fejezet nyitott kérdésként kezeli.</w:t>
       </w:r>
     </w:p>
     <w:p>
@@ -4657,7 +3252,7 @@
         <w:t xml:space="preserve">Bizalmi szintek és kliensregisztráció.</w:t>
       </w:r>
       <w:r>
-        <w:t xml:space="preserve"> A rendelet a melléklet M3.1 pontja szerinti három bizalmi szintet állapítja meg, szintenként meghatározva a regisztráció módját, a kliens hitelesítésének követelményeit és az elérhető funkciókört. Az 1. szintre a dinamikus kliensregisztráció (RFC 7591) egyedi engedélyezési eljárás nélkül érvényes; a 3. szinthez emelt biztonsági profil (FAPI 2.0 Security Profile) vagy azzal egyenértékű megoldás és kliensattesztáció szükséges.</w:t>
+        <w:t xml:space="preserve"> A rendelet a melléklet M3.1 pontja szerinti három bizalmi szintet állapítja meg, szintenként meghatározva a regisztráció módját, a kliens hitelesítésének követelményeit és az elérhető funkciókört. Az első szintre a dinamikus kliensregisztráció (RFC 7591) egyedi engedélyezési eljárás nélkül érvényes; a harmadik szinthez emelt biztonsági profil (FAPI 2.0 Security Profile) vagy azzal egyenértékű megoldás és kliensattesztáció szükséges.</w:t>
       </w:r>
     </w:p>
     <w:p>
@@ -4689,7 +3284,7 @@
         <w:t xml:space="preserve">A továbbítási nyilatkozat és a jóváhagyó képernyő.</w:t>
       </w:r>
       <w:r>
-        <w:t xml:space="preserve"> A kiadó a nyilvántartásba vételkor nyilatkozik az Nkt. B) § (1) bekezdése szerinti adatokról. A jóváhagyó képernyő a hivatalos felületen jelenik meg, köznyelven, a nyilvántartás adatai alapján, a szoftver által nem módosítható módon. A rendelet a kötelező tartalmi elemeket írja elő, nem a szövegezést.</w:t>
+        <w:t xml:space="preserve"> A kiadó a nyilvántartásba vételkor nyilatkozik az Nkt. B) § (1) bekezdése szerinti adatokról. A jóváhagyó képernyő a hivatalos felületen jelenik meg, köznyelven, a nyilvántartás adatai alapján, a szoftver által nem módosítható módon. A rendelet a kötelező tartalmi elemeket írja elő, a szövegezést nem.</w:t>
       </w:r>
     </w:p>
     <w:p>
@@ -4768,107 +3363,16 @@
         <w:jc w:val="both"/>
       </w:pPr>
       <w:r>
-        <w:t xml:space="preserve">Javasoljuk, hogy a kormányrendelet írjon elő pilot-mérést, amelynek eredménye a műveleti és a pedagógusi szakasz indítása előtt rendelkezésre áll.</w:t>
-      </w:r>
-    </w:p>
-    <w:p>
-      <w:pPr>
-        <w:pStyle w:val="ListParagraph"/>
-        <w:numPr>
-          <w:ilvl w:val="0"/>
-          <w:numId w:val="1"/>
-        </w:numPr>
-        <w:spacing w:after="60"/>
-      </w:pPr>
-      <w:r>
-        <w:rPr>
-          <w:b/>
-          <w:bCs/>
-        </w:rPr>
-        <w:t xml:space="preserve">Kör:</w:t>
-      </w:r>
-      <w:r>
-        <w:t xml:space="preserve"> legalább néhány száz pedagógus, több intézménytípusból (általános iskola, gimnázium, szakképző intézmény) és több fenntartótól.</w:t>
-      </w:r>
-    </w:p>
-    <w:p>
-      <w:pPr>
-        <w:pStyle w:val="ListParagraph"/>
-        <w:numPr>
-          <w:ilvl w:val="0"/>
-          <w:numId w:val="1"/>
-        </w:numPr>
-        <w:spacing w:after="60"/>
-      </w:pPr>
-      <w:r>
-        <w:rPr>
-          <w:b/>
-          <w:bCs/>
-        </w:rPr>
-        <w:t xml:space="preserve">Mit mér:</w:t>
-      </w:r>
-      <w:r>
-        <w:t xml:space="preserve"> a 3.2 pontban felsorolt öt kérdést — az adminisztrációs idő folyamatonkénti megoszlását, a tanulmányi rendszerből adatot igénylő folyamatok arányát, az azonos folyamat időigényét integrált MI-vel, az utóellenőrzésre fordított időt, valamint a hibaarány változását.</w:t>
-      </w:r>
-    </w:p>
-    <w:p>
-      <w:pPr>
-        <w:pStyle w:val="ListParagraph"/>
-        <w:numPr>
-          <w:ilvl w:val="0"/>
-          <w:numId w:val="1"/>
-        </w:numPr>
-        <w:spacing w:after="60"/>
-      </w:pPr>
-      <w:r>
-        <w:rPr>
-          <w:b/>
-          <w:bCs/>
-        </w:rPr>
-        <w:t xml:space="preserve">Hogyan mér:</w:t>
-      </w:r>
-      <w:r>
-        <w:t xml:space="preserve"> ahol lehetséges, hasonló feladatot végző kontrollcsoporttal összevetve, hogy az eredmény ne pusztán az előtte-utána különbségén múljon.</w:t>
-      </w:r>
-    </w:p>
-    <w:p>
-      <w:pPr>
-        <w:pStyle w:val="ListParagraph"/>
-        <w:numPr>
-          <w:ilvl w:val="0"/>
-          <w:numId w:val="1"/>
-        </w:numPr>
-        <w:spacing w:after="60"/>
-      </w:pPr>
-      <w:r>
-        <w:rPr>
-          <w:b/>
-          <w:bCs/>
-        </w:rPr>
-        <w:t xml:space="preserve">Eredménye:</w:t>
-      </w:r>
-      <w:r>
-        <w:t xml:space="preserve"> nyilvános, és a funkciókatalógus, valamint a 2028. szeptemberi szakasz megalapozását szolgálja.</w:t>
-      </w:r>
-    </w:p>
-    <w:p>
-      <w:pPr>
-        <w:pStyle w:val="ListParagraph"/>
-        <w:numPr>
-          <w:ilvl w:val="0"/>
-          <w:numId w:val="1"/>
-        </w:numPr>
-        <w:spacing w:after="60"/>
-      </w:pPr>
-      <w:r>
-        <w:rPr>
-          <w:b/>
-          <w:bCs/>
-        </w:rPr>
-        <w:t xml:space="preserve">Ha a pilot nem igazolja az időnyereséget</w:t>
-      </w:r>
-      <w:r>
-        <w:t xml:space="preserve">, a javaslat olvasási része akkor is indokolt marad: az az érintett saját adatához való hozzáférésről szól, nem a pedagógusi hatékonyságról.</w:t>
+        <w:t xml:space="preserve">Javasoljuk, hogy a kormányrendelet írjon elő pilot-mérést, amelynek eredménye a műveleti és a pedagógusi szakasz indítása előtt rendelkezésre áll. A mérés legalább néhány száz pedagógusra terjedjen ki, több intézménytípusból, köztük általános iskolából, gimnáziumból és szakképző intézményből, és több fenntartótól. Tárgya a 3.2 pontban felsorolt öt kérdés: az adminisztrációs idő folyamatonkénti megoszlása, a tanulmányi rendszerből adatot igénylő folyamatok aránya, az azonos folyamat időigénye integrált MI-vel, az utóellenőrzésre fordított idő, valamint a hibaarány változása. Ahol lehetséges, hasonló feladatot végző kontrollcsoporttal összevetve mérjen, hogy az eredmény ne pusztán az előtte-utána különbségén múljon. Az eredmény nyilvános, és a funkciókatalógus, valamint a 2028. szeptemberi szakasz megalapozását szolgálja.</w:t>
+      </w:r>
+    </w:p>
+    <w:p>
+      <w:pPr>
+        <w:spacing w:after="140"/>
+        <w:jc w:val="both"/>
+      </w:pPr>
+      <w:r>
+        <w:t xml:space="preserve">Ha a pilot nem igazolja az időnyereséget, a javaslat olvasási része akkor is indokolt marad, mert annak indoka az érintett saját adatához való hozzáférés.</w:t>
       </w:r>
     </w:p>
     <w:p>
@@ -5195,7 +3699,7 @@
                 <w:sz w:val="18"/>
                 <w:szCs w:val="18"/>
               </w:rPr>
-              <w:t xml:space="preserve"> hozzáférés szülői és tanulói jogosultságra, 1. bizalmi szinten, alapadatkörben, a köznyelvi tájékoztatással együtt. </w:t>
+              <w:t xml:space="preserve"> hozzáférés szülői és tanulói jogosultságra, első bizalmi szinten, alapadatkörben, a köznyelvi tájékoztatással együtt. </w:t>
             </w:r>
             <w:r>
               <w:rPr>
@@ -5322,7 +3826,7 @@
                 <w:sz w:val="18"/>
                 <w:szCs w:val="18"/>
               </w:rPr>
-              <w:t xml:space="preserve">: műveletvégzés az érintett saját adatkörében (2. szint); pedagógusi hozzáférés intézményi engedélyezéssel (3. szint), a pilot eredményére alapozva. Felsőoktatás: éles delegált olvasási hozzáférés</w:t>
+              <w:t xml:space="preserve">: műveletvégzés az érintett saját adatkörében (második szint); pedagógusi hozzáférés intézményi engedélyezéssel (harmadik szint), a pilot eredményére alapozva. Felsőoktatás: éles delegált olvasási hozzáférés</w:t>
             </w:r>
           </w:p>
         </w:tc>
@@ -5444,27 +3948,7 @@
         <w:jc w:val="both"/>
       </w:pPr>
       <w:r>
-        <w:t xml:space="preserve">A szakaszolás lényege: </w:t>
-      </w:r>
-      <w:r>
-        <w:rPr>
-          <w:b/>
-          <w:bCs/>
-        </w:rPr>
-        <w:t xml:space="preserve">az olvasás előbb megy élesbe, mint az írás</w:t>
-      </w:r>
-      <w:r>
-        <w:t xml:space="preserve">, a pedagógusi hozzáférés csak az intézményi engedélyezéssel együtt indul, és </w:t>
-      </w:r>
-      <w:r>
-        <w:rPr>
-          <w:b/>
-          <w:bCs/>
-        </w:rPr>
-        <w:t xml:space="preserve">a pedagógusi szakaszt magyar mérés előzi meg</w:t>
-      </w:r>
-      <w:r>
-        <w:t xml:space="preserve">.</w:t>
+        <w:t xml:space="preserve">A szakaszolás lényege, hogy az olvasás előbb megy élesbe, mint az írás, a pedagógusi hozzáférés csak az intézményi engedélyezési mechanizmussal együtt indul, és a pedagógusi szakaszt magyar mérés előzi meg.</w:t>
       </w:r>
     </w:p>
     <w:p>
@@ -5493,7 +3977,7 @@
         <w:jc w:val="both"/>
       </w:pPr>
       <w:r>
-        <w:t xml:space="preserve">Ezeket a kérdéseket a javaslat nem dönti el. Azért soroljuk fel, mert a szakmai vitában úgyis előkerülnek, és jobb, ha az előterjesztő nevezi meg őket.</w:t>
+        <w:t xml:space="preserve">Az alábbi kérdéseket a javaslat nem dönti el, de a szakmai vitában várhatóan felmerülnek, ezért érdemesnek tartottuk megnevezni őket.</w:t>
       </w:r>
     </w:p>
     <w:p>
@@ -5510,10 +3994,10 @@
           <w:b/>
           <w:bCs/>
         </w:rPr>
-        <w:t xml:space="preserve">Ki vezesse a kliensnyilvántartást</w:t>
-      </w:r>
-      <w:r>
-        <w:t xml:space="preserve">, milyen eljárásrenddel, jogorvoslattal és finanszírozással? Az előterjesztés csak annyit rögzít, hogy a szervet a Kormány rendeletben jelöli ki.</w:t>
+        <w:t xml:space="preserve">A kliensnyilvántartás vezetése.</w:t>
+      </w:r>
+      <w:r>
+        <w:t xml:space="preserve"> Mely szerv vezesse, milyen eljárásrenddel, jogorvoslattal és finanszírozással. Az előterjesztés csak annyit rögzít, hogy a szervet a Kormány rendeletben jelöli ki.</w:t>
       </w:r>
     </w:p>
     <w:p>
@@ -5530,10 +4014,10 @@
           <w:b/>
           <w:bCs/>
         </w:rPr>
-        <w:t xml:space="preserve">A nagykorúsághoz közeledő tanuló</w:t>
-      </w:r>
-      <w:r>
-        <w:t xml:space="preserve"> saját felhatalmazása és a szülői felhatalmazás viszonya; melyik életkortól illeti meg a tanulót önálló jog, és mit lát ilyenkor a szülő.</w:t>
+        <w:t xml:space="preserve">A nagykorúsághoz közeledő tanuló.</w:t>
+      </w:r>
+      <w:r>
+        <w:t xml:space="preserve"> Hogyan viszonyul egymáshoz a tanuló saját felhatalmazása és a szülői felhatalmazás, melyik életkortól illeti meg a tanulót önálló jog, és mit lát ilyenkor a szülő.</w:t>
       </w:r>
     </w:p>
     <w:p>
@@ -5550,20 +4034,10 @@
           <w:b/>
           <w:bCs/>
         </w:rPr>
-        <w:t xml:space="preserve">Az adatkörök tételes, mezőszintű besorolása</w:t>
-      </w:r>
-      <w:r>
-        <w:t xml:space="preserve"> a funkciókatalógusban. A melléklet M4.3 pontja megadja a három kategóriát és az alapértelmezést; a besorolás elvégzése önálló, jelentős szakmai munka. A szülői és tanulói </w:t>
-      </w:r>
-      <w:r>
-        <w:rPr>
-          <w:b/>
-          <w:bCs/>
-        </w:rPr>
-        <w:t xml:space="preserve">olvasási</w:t>
-      </w:r>
-      <w:r>
-        <w:t xml:space="preserve"> funkciókra készült egy első vázlat (külön melléklet), amely húsz valós KRÉTA-végpontot sorol be, és hat nehéz esetet nevez meg. A műveleti és a pedagógusi funkciók besorolása még hátravan, és az üzemeltető funkciólistáját igényli.</w:t>
+        <w:t xml:space="preserve">Az adatkörök mezőszintű besorolása.</w:t>
+      </w:r>
+      <w:r>
+        <w:t xml:space="preserve"> A melléklet M4.3 pontja megadja a kategóriákat és az alapértelmezést, de a besorolás elvégzése önálló, jelentős szakmai munka. A szülői és tanulói olvasási funkciókra készült egy első vázlat külön mellékletben, amely húsz valós KRÉTA-végpontot sorol be, és hat nehéz esetet nevez meg. A műveleti és a pedagógusi funkciók besorolása még hátravan, és az üzemeltető funkciólistáját igényli.</w:t>
       </w:r>
     </w:p>
     <w:p>
@@ -5580,10 +4054,10 @@
           <w:b/>
           <w:bCs/>
         </w:rPr>
-        <w:t xml:space="preserve">Mit tehet az MI-szolgáltató a kapott adattal a saját rendszerén belül?</w:t>
-      </w:r>
-      <w:r>
-        <w:t xml:space="preserve"> A javaslat előírja, hogy erről tájékoztatni kell, és megtiltja a korlátozott továbbítású adatkör továbbítását, de nem szabályozza a szolgáltató belső adatkezelését. Ez önálló szabályozási réteg.</w:t>
+        <w:t xml:space="preserve">Az MI-szolgáltató belső adatkezelése.</w:t>
+      </w:r>
+      <w:r>
+        <w:t xml:space="preserve"> A javaslat előírja, hogy erről tájékoztatni kell, és megtiltja a korlátozott továbbítású adatkör továbbítását, de nem szabályozza, mit tehet a szolgáltató a kapott adattal a saját rendszerén belül. Ez önálló szabályozási réteg.</w:t>
       </w:r>
     </w:p>
     <w:p>
@@ -5623,7 +4097,7 @@
         <w:t xml:space="preserve">A továbbítási nyilatkozat ellenőrzése.</w:t>
       </w:r>
       <w:r>
-        <w:t xml:space="preserve"> A javaslat szankcionálja a valótlan nyilatkozatot, de nem mondja meg, ki és hogyan ellenőrzi. Bejelentésre, mintavétellel vagy rendszeresen?</w:t>
+        <w:t xml:space="preserve"> A javaslat szankcionálja a valótlan nyilatkozatot, de nem mondja meg, ki és milyen rendszerességgel ellenőrzi.</w:t>
       </w:r>
     </w:p>
     <w:p>
@@ -5643,7 +4117,7 @@
         <w:t xml:space="preserve">Statisztikai pontosítások.</w:t>
       </w:r>
       <w:r>
-        <w:t xml:space="preserve"> Az átlagos osztálylétszám, a KRÉTA-alkalmazások megjelenési éve és a KRÉTA-tudásbázis hivatkozásának pontos adatai még pótlandók (a szövegben [ELLENŐRIZENDŐ] jelöléssel).</w:t>
+        <w:t xml:space="preserve"> Az átlagos osztálylétszám, a KRÉTA-alkalmazások megjelenési éve és a KRÉTA-tudásbázis hivatkozásának pontos adatai még pótlandók; a szövegben [ELLENŐRIZENDŐ] jelöli őket.</w:t>
       </w:r>
     </w:p>
     <w:p>
@@ -5663,7 +4137,7 @@
         <w:t xml:space="preserve">Az érdekütközés kezelése.</w:t>
       </w:r>
       <w:r>
-        <w:t xml:space="preserve"> Az előterjesztés készítője az 1.6 pontban leírt szolgáltatás üzemeltetője. A javaslat elfogadása ezt a szolgáltatást a jelenlegi formájában feleslegessé teszi, de a jövőbeli piacon az előterjesztő is szereplő lehet.</w:t>
+        <w:t xml:space="preserve"> Az előterjesztés készítője az 1.6 pontban leírt szolgáltatás üzemeltetője. A javaslat elfogadása ezt a szolgáltatást a jelenlegi formájában feleslegessé teszi. A jövőbeli piacon az előterjesztő is szereplő lehet.</w:t>
       </w:r>
     </w:p>
     <w:p>

</xml_diff>

<commit_message>
A "túlfogalmazás" kikerül a Mit nem állítunk felvezetéséből
A szó a kivett antitézis maradéka volt: az eredeti mondat szerint az ellenérvek
nem magát a javaslatot, hanem annak túlfogalmazását célozzák. A tagadott félhez
képest volt jelentése, önmagában nem mond semmit, és nem is bevett kifejezés.

A felvezető mondat törölve. A szakaszcím elmondja, mi következik, a négy
bekezdés pedig konkrétan sorolja a határokat.

Co-Authored-By: Claude Opus 5 <noreply@anthropic.com>
Claude-Session: https://claude.ai/code/session_014aQq53hk1s8SESmduMDC8u
</commit_message>
<xml_diff>
--- a/eloterjesztes/AI-Orszag-sajat-oktatasi-adat-torzs.docx
+++ b/eloterjesztes/AI-Orszag-sajat-oktatasi-adat-torzs.docx
@@ -123,15 +123,6 @@
       </w:pPr>
       <w:r>
         <w:t xml:space="preserve">Mit nem állítunk</w:t>
-      </w:r>
-    </w:p>
-    <w:p>
-      <w:pPr>
-        <w:spacing w:after="140"/>
-        <w:jc w:val="both"/>
-      </w:pPr>
-      <w:r>
-        <w:t xml:space="preserve">A javaslattal szembeni ellenérvek jellemzően a túlfogalmazást szokták célozni, ezért néhány határt érdemes elöl tisztázni.</w:t>
       </w:r>
     </w:p>
     <w:p>

</xml_diff>

<commit_message>
Az Üzenőfüzet prototípus, nem üzemelő szolgáltatás
Az anyagok eddig azt állították, hogy az előterjesztő üzemelteti az Üzenőfüzetet,
és hogy a szolgáltatás ma szülők asszisztensét köti össze a KRÉTA-val. Ez
pontatlan. Prototípus készült, amely a valódi KRÉTA-val működik, nyilvános
szolgáltatásként viszont nem érhető el.

A pontos változat erősebb érv is. A fejlesztés éppen azon a ponton állt meg, ahol
a nyilvánossá tétel következett volna, mert ahhoz jelszót kellett volna kérni a
szülőktől, nem dokumentált végpontokra építeni, és lakossági hálózaton
továbbítani a hívásokat. Ez konkrétabban mutatja a hiányt, mint bármilyen
felhasználószám.

Javítva a törzsanyagban, a döntéshozói összefoglalóban, a funkciókatalógusban, az
összevetésben és a teljes változatban, az érdekütközési nyilatkozatokkal együtt.

Co-Authored-By: Claude Opus 5 <noreply@anthropic.com>
Claude-Session: https://claude.ai/code/session_014aQq53hk1s8SESmduMDC8u
</commit_message>
<xml_diff>
--- a/eloterjesztes/AI-Orszag-sajat-oktatasi-adat-torzs.docx
+++ b/eloterjesztes/AI-Orszag-sajat-oktatasi-adat-torzs.docx
@@ -48,7 +48,7 @@
         <w:jc w:val="both"/>
       </w:pPr>
       <w:r>
-        <w:t xml:space="preserve">Az anyag egy működő implementáció tapasztalataiból épült. Az Üzenőfüzet nyílt forráskódú szolgáltatás ma ténylegesen összeköti a szülők MI-asszisztensét a KRÉTA-val, és minden megkerülő megoldás, amelyre a szolgáltatás rákényszerül, egy-egy hiányzó szabályra mutat rá. Ezeket az 1.6 pont sorolja fel. A javaslathoz tartozó funkciókatalógus vázlata is ebből a szolgáltatásból készült, húsz valós végpont besorolásával, így a javasolt szabály kipróbálható anyagon áll.</w:t>
+        <w:t xml:space="preserve">Az anyag egy működő prototípus tapasztalataiból épült. Az Üzenőfüzet nyílt forráskódú prototípus a valódi KRÉTA-val működik, és a szülő hozzáférését köti össze egy MI-asszisztenssel. Nyilvános szolgáltatásként nem érhető el: a fejlesztés éppen azon a ponton állt meg, ahol a nyilvánossá tétel következett volna, mert ahhoz olyan megoldásokra lett volna szükség, amelyeket az 1.6 pont sorol fel. A javaslathoz tartozó funkciókatalógus vázlata ugyanebből a prototípusból készült, húsz valós végpont besorolásával.</w:t>
       </w:r>
     </w:p>
     <w:p>
@@ -1027,16 +1027,16 @@
         <w:jc w:val="both"/>
       </w:pPr>
       <w:r>
-        <w:t xml:space="preserve">Erre konkrét példa az Üzenőfüzet nyílt forráskódú szolgáltatás, amelyet az előterjesztés készítője üzemeltet, és amely a szülők MI-asszisztensét köti össze a KRÉTA-val. A szolgáltatás ma kénytelen átvenni a szülőtől a KRÉTA-jelszót, a nevében belépni és a belépési tokeneket maga tárolni. A hivatalos tanulói mobilalkalmazás kliensazonosítóját és nem dokumentált végpontjait használja, ezért bármely rendszerfrissítés után működésképtelenné válhat. A hívásokat lakossági hálózaton keresztül továbbítja, mert a rendszer az adatközponti hálózatokból érkező kéréseket elutasítja. Végül saját adatkezelési tájékoztatójában kell rendeznie, hogy a lekért adatok, köztük kiskorúak adatai, a szülő által választott, akár az Unión kívüli MI-szolgáltatóhoz kerülnek.</w:t>
-      </w:r>
-    </w:p>
-    <w:p>
-      <w:pPr>
-        <w:spacing w:after="140"/>
-        <w:jc w:val="both"/>
-      </w:pPr>
-      <w:r>
-        <w:t xml:space="preserve">A szülő a kiadott hozzáférést a KRÉTA-ban nem látja, és ott nem is tudja visszavonni. Az Üzenőfüzet célja éppen az, hogy ez a közvetítő szerep ebben a formában feleslegessé váljon. Az előterjesztő érdekeltségét itt jelezzük: a javaslat elfogadása a saját szolgáltatásunk jelenlegi működési modelljét szünteti meg.</w:t>
+        <w:t xml:space="preserve">Erre konkrét példa az Üzenőfüzet nyílt forráskódú prototípus, amelyet az előterjesztés készítője fejlesztett, és amely a szülő MI-asszisztensét köti össze a KRÉTA-val. Ahhoz, hogy egyáltalán működjön, át kell vennie a szülőtől a KRÉTA-jelszót, a nevében kell belépnie, és a belépési tokeneket magának kell tárolnia. A hivatalos tanulói mobilalkalmazás kliensazonosítóját és nem dokumentált végpontjait használja, ezért bármely rendszerfrissítés után működésképtelenné válhat. A hívásokat lakossági hálózaton keresztül továbbítja, mert a rendszer az adatközponti hálózatokból érkező kéréseket elutasítja. Végül saját adatkezelési tájékoztatójában kell rendeznie, hogy a lekért adatok, köztük kiskorúak adatai, a szülő által választott, akár az Unión kívüli MI-szolgáltatóhoz kerülnek.</w:t>
+      </w:r>
+    </w:p>
+    <w:p>
+      <w:pPr>
+        <w:spacing w:after="140"/>
+        <w:jc w:val="both"/>
+      </w:pPr>
+      <w:r>
+        <w:t xml:space="preserve">A szülő a kiadott hozzáférést a KRÉTA-ban nem látja, és ott nem is tudja visszavonni. Ezek a kényszerek együtt oda vezettek, hogy a prototípus nyilvános szolgáltatásként nem vállalható, és a fejlesztés ezen a ponton megállt. Az előterjesztő érdekeltségét itt jelezzük: a javaslat elfogadása éppen ezeket a közvetítő megoldásokat tenné szükségtelenné.</w:t>
       </w:r>
     </w:p>
     <w:p>
@@ -4128,7 +4128,7 @@
         <w:t xml:space="preserve">Az érdekütközés kezelése.</w:t>
       </w:r>
       <w:r>
-        <w:t xml:space="preserve"> Az előterjesztés készítője az 1.6 pontban leírt szolgáltatás üzemeltetője. A javaslat elfogadása ezt a szolgáltatást a jelenlegi formájában feleslegessé teszi. A jövőbeli piacon az előterjesztő is szereplő lehet.</w:t>
+        <w:t xml:space="preserve"> Az 1.6 pontban leírt prototípust az előterjesztés készítője fejlesztette. A javaslat elfogadása a prototípus jelenlegi közvetítő megoldásait tenné szükségtelenné, és a létrejövő piacon az előterjesztő is szereplő lehet.</w:t>
       </w:r>
     </w:p>
     <w:p>

</xml_diff>